<commit_message>
docs: update status after Building Simulation submission (BUIL-S-26-00752)
- Paper submitted to Building Simulation (Springer) via EM on 2026-05-08
- Manuscript number: BUIL-S-26-00752
- Final manuscript fixes: Table 3 reorder, state-of-the-art removal, n-scaling reframing
- Regenerated all DOCX files (blinded_manuscript, paper_final, title_page, cover_letter)
- Updated CLAUDE.md status to reflect submission completion

Co-Authored-By: Claude Opus 4.6 <noreply@anthropic.com>
</commit_message>
<xml_diff>
--- a/docs/blinded_manuscript.docx
+++ b/docs/blinded_manuscript.docx
@@ -2,48 +2,13 @@
 <file path=word/document.xml><?xml version="1.0" encoding="utf-8"?>
 <w:document xmlns:w="http://schemas.openxmlformats.org/wordprocessingml/2006/main" xmlns:m="http://schemas.openxmlformats.org/officeDocument/2006/math" xmlns:r="http://schemas.openxmlformats.org/officeDocument/2006/relationships" xmlns:o="urn:schemas-microsoft-com:office:office" xmlns:v="urn:schemas-microsoft-com:vml" xmlns:w10="urn:schemas-microsoft-com:office:word" xmlns:a="http://schemas.openxmlformats.org/drawingml/2006/main" xmlns:pic="http://schemas.openxmlformats.org/drawingml/2006/picture" xmlns:wp="http://schemas.openxmlformats.org/drawingml/2006/wordprocessingDrawing">
   <w:body>
-    <w:sdt>
-      <w:sdtPr>
-        <w:docPartObj>
-          <w:docPartGallery w:val="Table of Contents"/>
-          <w:docPartUnique/>
-        </w:docPartObj>
-      </w:sdtPr>
-      <w:sdtContent>
-        <w:p>
-          <w:pPr>
-            <w:pStyle w:val="TOCHeading"/>
-          </w:pPr>
-          <w:r>
-            <w:t xml:space="preserve">Table of Contents</w:t>
-          </w:r>
-        </w:p>
-        <w:p>
-          <w:r>
-            <w:fldChar w:fldCharType="begin" w:dirty="true"/>
-            <w:instrText xml:space="preserve">TOC \o "1-3" \h \z \u</w:instrText>
-            <w:fldChar w:fldCharType="separate"/>
-            <w:fldChar w:fldCharType="end"/>
-          </w:r>
-        </w:p>
-      </w:sdtContent>
-    </w:sdt>
-    <w:bookmarkStart w:id="45" w:name="Xb5a71e468445f1486cddda9b1378d41057800b4"/>
+    <w:bookmarkStart w:id="44" w:name="X350c0185c3a75771eb13e096e76d8fb7850fc56"/>
     <w:p>
       <w:pPr>
         <w:pStyle w:val="Heading1"/>
       </w:pPr>
       <w:r>
-        <w:rPr>
-          <w:rStyle w:val="SectionNumber"/>
-        </w:rPr>
-        <w:t xml:space="preserve">1</w:t>
-      </w:r>
-      <w:r>
-        <w:tab/>
-      </w:r>
-      <w:r>
-        <w:t xml:space="preserve">The Operational Diversity Hypothesis: Why Pattern Coverage, Not Corpus Scale, Governs Zero-Shot Building Load Forecasting</w:t>
+        <w:t xml:space="preserve">Operational Diversity by Design: A Parametric Simulation Methodology for Zero-Shot Building Load Forecasting</w:t>
       </w:r>
     </w:p>
     <w:p>
@@ -59,15 +24,6 @@
         <w:pStyle w:val="Heading2"/>
       </w:pPr>
       <w:r>
-        <w:rPr>
-          <w:rStyle w:val="SectionNumber"/>
-        </w:rPr>
-        <w:t xml:space="preserve">1.1</w:t>
-      </w:r>
-      <w:r>
-        <w:tab/>
-      </w:r>
-      <w:r>
         <w:t xml:space="preserve">Abstract</w:t>
       </w:r>
     </w:p>
@@ -76,7 +32,23 @@
         <w:pStyle w:val="FirstParagraph"/>
       </w:pPr>
       <w:r>
-        <w:t xml:space="preserve">Foundation models for building energy forecasting are trained on massive synthetic corpora under the implicit assumption that scale drives generalization. We challenge this assumption by proposing the Operational Diversity Hypothesis: zero-shot forecasting accuracy is governed primarily by the coverage of distinct temporal load patterns in the training set, not by the number of buildings. We test this hypothesis through a controlled experiment comparing two training corpora of equal size (700 buildings each): one sampled from the 900,000-building Buildings-900K stock-model corpus, and one constructed via 12-dimensional Latin Hypercube Sampling (LHS) over operational schedule parameters. Both train the same Transformer architecture under identical conditions. The LHS-designed corpus achieves 13.11 ± 0.17% NRMSE (five-seed mean) on 955 real U.S. and Portuguese commercial buildings—matching the full 900,000-building baseline (13.27%)—while the stock-model sample of equal size under identical training conditions reaches only 14.26% (seed 42). An n-scaling analysis reveals that performance saturates at 70 buildings, consistent with a learning regime governed by pattern coverage rather than sample count. RevIN is beneficial in small diverse datasets but degrades the full 900K corpus, demonstrating regime-dependent normalization effects. A U.S.-weather ablation preserves the advantage over equal-scale controls, ruling out climate origin as the sole driver. These findings reframe the data requirement for zero-shot building load forecasting from a scale problem to a design problem, with immediate practical implications: a single workstation day of simulation suffices where a national building stock database was previously assumed necessary.</w:t>
+        <w:t xml:space="preserve">Zero-shot building load forecasting requires simulation datasets that capture diverse real-world operational patterns. Existing approaches often rely on large building-stock databases, but less attention has been paid to how simulation data should be designed to cover temporal operating regimes. This paper proposes a parametric EnergyPlus simulation design methodology grounded in the Operational Diversity Hypothesis: zero-shot generalization depends not only on the number of simulated buildings, but also on the coverage of distinct temporal load patterns.</w:t>
+      </w:r>
+    </w:p>
+    <w:p>
+      <w:pPr>
+        <w:pStyle w:val="BodyText"/>
+      </w:pPr>
+      <w:r>
+        <w:t xml:space="preserve">The proposed methodology parameterizes commercial building operation across key schedule dimensions, including operating hours, baseload behavior, equipment retention, weekly disruptions, seasonal variation, and stochastic noise. Latin Hypercube Sampling is used to construct a compact simulation dataset that deliberately spans this operational schedule space across commercial building archetypes. The resulting simulations are combined with Reversible Instance Normalization and data augmentation to train a Transformer-based zero-shot load forecasting model.</w:t>
+      </w:r>
+    </w:p>
+    <w:p>
+      <w:pPr>
+        <w:pStyle w:val="BodyText"/>
+      </w:pPr>
+      <w:r>
+        <w:t xml:space="preserve">Evaluation on real commercial building loads shows that the designed simulation dataset achieves benchmark-level transfer performance while requiring far fewer simulations than large stock-model pipelines. Equal-scale controls, weather-origin ablations, and dataset-size scaling experiments indicate that systematic coverage of operational patterns is a major contributor to transferability. These findings support a data-centric simulation design approach for zero-shot building load forecasting, shifting the data requirement from brute-force stock-model scaling toward targeted operational diversity.</w:t>
       </w:r>
     </w:p>
     <w:p>
@@ -91,7 +63,7 @@
         <w:t xml:space="preserve">Keywords</w:t>
       </w:r>
       <w:r>
-        <w:t xml:space="preserve">: operational diversity, zero-shot forecasting, building energy, foundation models, data-centric AI, Latin Hypercube Sampling, pattern coverage</w:t>
+        <w:t xml:space="preserve">: operational diversity, zero-shot forecasting, building energy, foundation models, data-centric AI, Latin Hypercube Sampling</w:t>
       </w:r>
     </w:p>
     <w:p>
@@ -108,34 +80,16 @@
         <w:pStyle w:val="Heading2"/>
       </w:pPr>
       <w:r>
-        <w:rPr>
-          <w:rStyle w:val="SectionNumber"/>
-        </w:rPr>
-        <w:t xml:space="preserve">1.2</w:t>
-      </w:r>
-      <w:r>
-        <w:tab/>
-      </w:r>
-      <w:r>
         <w:t xml:space="preserve">1. Introduction</w:t>
       </w:r>
     </w:p>
-    <w:bookmarkStart w:id="10" w:name="X366e020859ef67edc6ddb0a94944bcf59b3e60f"/>
+    <w:bookmarkStart w:id="10" w:name="X60366f16a734802c495278164715228ef09540b"/>
     <w:p>
       <w:pPr>
         <w:pStyle w:val="Heading3"/>
       </w:pPr>
       <w:r>
-        <w:rPr>
-          <w:rStyle w:val="SectionNumber"/>
-        </w:rPr>
-        <w:t xml:space="preserve">1.2.1</w:t>
-      </w:r>
-      <w:r>
-        <w:tab/>
-      </w:r>
-      <w:r>
-        <w:t xml:space="preserve">1.1 The Scale Assumption in Building Energy Foundation Models</w:t>
+        <w:t xml:space="preserve">1.1 Simulation Design for Zero-Shot Building Load Forecasting</w:t>
       </w:r>
     </w:p>
     <w:p>
@@ -143,7 +97,7 @@
         <w:pStyle w:val="FirstParagraph"/>
       </w:pPr>
       <w:r>
-        <w:t xml:space="preserve">Short-term load forecasting underpins grid balancing, demand response, and real-time building energy management [1, 2]. Foundation models for time series—trained once and transferred to unseen targets—promise to replace the classical per-building approach. BuildingsBench [3] operationalized this for the building domain by assembling Buildings-900K, a corpus of roughly 900,000 synthetic buildings from the NREL End-Use Load Profiles database [4], and training a Transformer with Gaussian NLL loss. The result—13.28% median NRMSE on 955 real U.S. and Portuguese commercial buildings (which we reproduce at 13.27%)—established both a benchmark and an implicit assumption: that large-scale synthetic corpora are required for zero-shot generalization.</w:t>
+        <w:t xml:space="preserve">Short-term load forecasting underpins grid balancing, demand response, and real-time building energy management (Fan et al. 2017; Hong et al. 2019). Foundation models for time series—trained once and transferred to unseen targets—promise to replace the classical per-building approach, but their success depends critically on how the training corpus is designed. This design question has received surprisingly little attention: existing approaches have demonstrated the value of large-scale building stock databases, but the design of simulation data for temporal pattern coverage remains underexplored.</w:t>
       </w:r>
     </w:p>
     <w:p>
@@ -151,7 +105,15 @@
         <w:pStyle w:val="BodyText"/>
       </w:pPr>
       <w:r>
-        <w:t xml:space="preserve">This assumption parallels the scaling paradigm in natural language processing, where more data consistently yields better models. However, recent work has begun to question whether this paradigm transfers to time series. Shi et al. [5] showed that scaling laws for time series forecasting diverge from those in language modeling: more capable models do not always outperform less capable ones, and performance depends on the interaction between look-back horizon, autocorrelation, and non-stationarity. MOIRAI-MoE [6] achieved superior zero-shot performance through architectural specialization rather than increased scale. These findings suggest that the relationship between data volume and generalization may be fundamentally different in time series.</w:t>
+        <w:t xml:space="preserve">Large stock-model pipelines provide an important reference point for zero-shot building load forecasting. For example, the Buildings-900K corpus (Wilson et al. 2022; Emami et al. 2023) draws from the NREL End-Use Load Profiles database and serves as a widely used external reference for zero-shot building load forecasting. However, such pipelines are primarily designed to represent building-stock distributions, not to systematically span the operational schedule space. Buildings drawn from the same stock-model generation pipeline share common operational assumptions—similar occupancy schedules, equipment profiles, and HVAC operating logic—so adding more buildings may increase sample size without proportionally expanding the range of temporal dynamics the model encounters.</w:t>
+      </w:r>
+    </w:p>
+    <w:p>
+      <w:pPr>
+        <w:pStyle w:val="BodyText"/>
+      </w:pPr>
+      <w:r>
+        <w:t xml:space="preserve">Recent work on time series scaling laws suggests this distinction matters. Shi et al. (2024) showed that scaling behavior in time series forecasting diverges from language modeling: performance depends on the interaction between look-back horizon, autocorrelation, and non-stationarity, not simply on data volume. MOIRAI-MoE (Liu et al. 2025) achieved superior zero-shot performance through architectural specialization rather than increased scale. These findings motivate a systematic investigation of what properties of the training data actually govern zero-shot generalization in building energy forecasting.</w:t>
       </w:r>
     </w:p>
     <w:bookmarkEnd w:id="10"/>
@@ -161,15 +123,6 @@
         <w:pStyle w:val="Heading3"/>
       </w:pPr>
       <w:r>
-        <w:rPr>
-          <w:rStyle w:val="SectionNumber"/>
-        </w:rPr>
-        <w:t xml:space="preserve">1.2.2</w:t>
-      </w:r>
-      <w:r>
-        <w:tab/>
-      </w:r>
-      <w:r>
         <w:t xml:space="preserve">1.2 The Operational Diversity Hypothesis</w:t>
       </w:r>
     </w:p>
@@ -178,7 +131,7 @@
         <w:pStyle w:val="FirstParagraph"/>
       </w:pPr>
       <w:r>
-        <w:t xml:space="preserve">We propose a specific alternative to the scale assumption: the</w:t>
+        <w:t xml:space="preserve">This paper proposes a simulation design methodology grounded in a specific theoretical claim: the</w:t>
       </w:r>
       <w:r>
         <w:t xml:space="preserve"> </w:t>
@@ -191,7 +144,7 @@
         <w:t xml:space="preserve">Operational Diversity Hypothesis</w:t>
       </w:r>
       <w:r>
-        <w:t xml:space="preserve">. In zero-shot building load forecasting, prediction accuracy is governed primarily by the diversity of temporal load patterns in the training set—the coverage of the operational schedule space—rather than by the number of training buildings.</w:t>
+        <w:t xml:space="preserve">. In zero-shot building load forecasting, prediction accuracy depends not only on the number of training buildings, but also on the diversity of temporal load patterns in the training set—the coverage of the operational schedule space.</w:t>
       </w:r>
     </w:p>
     <w:p>
@@ -199,7 +152,7 @@
         <w:pStyle w:val="BodyText"/>
       </w:pPr>
       <w:r>
-        <w:t xml:space="preserve">The hypothesis rests on a structural observation about stock-model corpora. Buildings-900K, despite its size, draws from a single national stock-model generation pipeline. Buildings in such a corpus share common operational assumptions: most offices operate 08:00–18:00 on weekdays; most hospitals run continuously; most retail stores have moderate baseloads. Adding more buildings from this distribution increases sample size but not necessarily the range of temporal dynamics the model encounters. Many of the 900,000 buildings occupy a narrow region of the space of possible load profiles.</w:t>
+        <w:t xml:space="preserve">The hypothesis is motivated by a structural property of building energy time series. The temporal dynamics of a building’s load profile are shaped primarily by its operational schedule—operating hours, baseload behavior, equipment retention, weekly patterns, and seasonal variation. Stock-model corpora draw from statistical distributions of real building stocks, meaning most generated buildings cluster around typical operating conditions: offices running 08:00–18:00, hospitals operating continuously, retail with moderate baseloads. Increasing the number of buildings from such a distribution adds more samples near the mode without necessarily expanding the range of temporal patterns.</w:t>
       </w:r>
     </w:p>
     <w:p>
@@ -207,26 +160,17 @@
         <w:pStyle w:val="BodyText"/>
       </w:pPr>
       <w:r>
-        <w:t xml:space="preserve">An alternative is to construct a small training set with maximal operational diversity by design. If temporal pattern coverage—not sample count—is the operative factor, then a carefully designed corpus of hundreds of buildings should suffice where hundreds of thousands were previously assumed necessary.</w:t>
+        <w:t xml:space="preserve">If temporal pattern coverage—not sample count—is the operative factor, then an alternative design strategy becomes possible: construct a small training set that broadly covers the operational schedule space through systematic sampling. A carefully designed dataset of hundreds of buildings may therefore achieve comparable transfer performance to much larger stock-model datasets.</w:t>
       </w:r>
     </w:p>
     <w:bookmarkEnd w:id="11"/>
-    <w:bookmarkStart w:id="12" w:name="experimental-approach-and-contributions"/>
+    <w:bookmarkStart w:id="12" w:name="methodology-and-contributions"/>
     <w:p>
       <w:pPr>
         <w:pStyle w:val="Heading3"/>
       </w:pPr>
       <w:r>
-        <w:rPr>
-          <w:rStyle w:val="SectionNumber"/>
-        </w:rPr>
-        <w:t xml:space="preserve">1.2.3</w:t>
-      </w:r>
-      <w:r>
-        <w:tab/>
-      </w:r>
-      <w:r>
-        <w:t xml:space="preserve">1.3 Experimental Approach and Contributions</w:t>
+        <w:t xml:space="preserve">1.3 Methodology and Contributions</w:t>
       </w:r>
     </w:p>
     <w:p>
@@ -234,7 +178,7 @@
         <w:pStyle w:val="FirstParagraph"/>
       </w:pPr>
       <w:r>
-        <w:t xml:space="preserve">We test this hypothesis through a controlled experiment. We generate 700 EnergyPlus simulations (50 per archetype × 14 building types) with operational schedules sampled via 12-dimensional Latin Hypercube Sampling. The 12 parameters span operating hours, baseload characteristics, equipment retention, weekly disruptions, seasonal variation, and stochastic noise—designed to cover the space of plausible commercial building operations. Combined with Reversible Instance Normalization (RevIN) [8] and data augmentation, this corpus trains the identical Transformer used in BuildingsBench.</w:t>
+        <w:t xml:space="preserve">We instantiate this hypothesis through a concrete simulation design methodology. We generate 700 EnergyPlus simulations (50 per archetype × 14 commercial building types) with operational schedules sampled via 12-dimensional Latin Hypercube Sampling (LHS). The 12 parameters span operating hours, baseload characteristics, equipment retention, weekly disruptions, seasonal variation, and stochastic noise—designed to cover the space of plausible commercial building operations. Combined with Reversible Instance Normalization (RevIN) (Kim et al. 2022) and data augmentation, this corpus trains a standard Transformer with Gaussian NLL loss.</w:t>
       </w:r>
     </w:p>
     <w:p>
@@ -242,7 +186,7 @@
         <w:pStyle w:val="BodyText"/>
       </w:pPr>
       <w:r>
-        <w:t xml:space="preserve">The key innovation is not the use of LHS or RevIN individually—both are established techniques—but the demonstration that their combination reframes the data requirement for zero-shot building energy forecasting from a scale problem to a design problem. Specifically:</w:t>
+        <w:t xml:space="preserve">Both LHS and RevIN are established techniques; the contribution is demonstrating that their systematic combination reframes the data requirement for zero-shot building energy forecasting from a scale problem to a design problem. The contributions are:</w:t>
       </w:r>
     </w:p>
     <w:p>
@@ -257,13 +201,13 @@
           <w:b/>
           <w:bCs/>
         </w:rPr>
-        <w:t xml:space="preserve">The Operational Diversity Hypothesis is empirically supported.</w:t>
+        <w:t xml:space="preserve">A parametric simulation design methodology for zero-shot building load forecasting.</w:t>
       </w:r>
       <w:r>
         <w:t xml:space="preserve"> </w:t>
       </w:r>
       <w:r>
-        <w:t xml:space="preserve">At equal scale (700 buildings each), LHS-designed simulations outperform stock-model samples by 1.33 percentage points under identical training conditions (seed-42: 12.93% vs. 14.26%), isolating data design as the primary factor. The five-seed mean (13.11 ± 0.17%) matches the full 900K-building baseline (13.27%).</w:t>
+        <w:t xml:space="preserve">We define a multi-dimensional operational schedule parameter space and use LHS to promote broad coverage of temporal operating patterns across commercial building archetypes. The methodology produces a compact training dataset from EnergyPlus simulations, reducing the data-engineering effort associated with assembling national-scale stock-model datasets.</w:t>
       </w:r>
     </w:p>
     <w:p>
@@ -278,13 +222,13 @@
           <w:b/>
           <w:bCs/>
         </w:rPr>
-        <w:t xml:space="preserve">Pattern coverage, not sample count, governs accuracy.</w:t>
+        <w:t xml:space="preserve">A data-centric validation framework for simulation design.</w:t>
       </w:r>
       <w:r>
         <w:t xml:space="preserve"> </w:t>
       </w:r>
       <w:r>
-        <w:t xml:space="preserve">N-scaling analysis shows performance saturating at 70 buildings (5 per archetype). This is inconsistent with sample-count-driven learning and consistent with a regime where accuracy depends on the number of distinct temporal patterns.</w:t>
+        <w:t xml:space="preserve">We evaluate the designed simulation dataset under matched training conditions, weather-origin ablations, and dataset-size scaling experiments. These controlled comparisons examine whether operational schedule coverage improves zero-shot transferability independently of confounding factors. We use the BuildingsBench evaluation protocol (Emami et al. 2023) as an external reference for zero-shot transfer performance, but the focus of this work is the design of the simulation dataset rather than benchmark competition.</w:t>
       </w:r>
     </w:p>
     <w:p>
@@ -299,13 +243,13 @@
           <w:b/>
           <w:bCs/>
         </w:rPr>
-        <w:t xml:space="preserve">RevIN exhibits a regime-dependent normalization effect.</w:t>
+        <w:t xml:space="preserve">A normalization analysis for designed simulation datasets.</w:t>
       </w:r>
       <w:r>
         <w:t xml:space="preserve"> </w:t>
       </w:r>
       <w:r>
-        <w:t xml:space="preserve">RevIN improves small diverse datasets (−1.6 pp) but degrades the full 900K corpus (+0.62 pp). This asymmetry has a mechanistic explanation rooted in the information content of load magnitude across data regimes, with implications beyond building energy.</w:t>
+        <w:t xml:space="preserve">RevIN interacts with the information structure of the training data: it helps when load magnitude is decoupled from schedule dynamics and degrades performance when magnitude carries stock-model-specific information. This regime-dependent effect has implications for the broader time series community.</w:t>
       </w:r>
     </w:p>
     <w:p>
@@ -320,13 +264,13 @@
           <w:b/>
           <w:bCs/>
         </w:rPr>
-        <w:t xml:space="preserve">Cross-climate transfer rules out geographic confounds.</w:t>
+        <w:t xml:space="preserve">Practical guidance for compact simulation dataset construction.</w:t>
       </w:r>
       <w:r>
         <w:t xml:space="preserve"> </w:t>
       </w:r>
       <w:r>
-        <w:t xml:space="preserve">Korean-weather simulations achieve benchmark-level accuracy on U.S. and Portuguese loads. A U.S.-weather ablation using the same LHS schedules preserves the advantage over equal-scale controls, isolating schedule diversity from climate origin.</w:t>
+        <w:t xml:space="preserve">The proposed workflow demonstrates that targeted operational diversity can achieve benchmark-level zero-shot transfer, reducing the need for national-scale stock-model pipelines. Weather-origin ablations confirm that the benefit persists across different climate files.</w:t>
       </w:r>
     </w:p>
     <w:p>
@@ -338,40 +282,22 @@
     </w:p>
     <w:bookmarkEnd w:id="12"/>
     <w:bookmarkEnd w:id="13"/>
-    <w:bookmarkStart w:id="18" w:name="related-work"/>
+    <w:bookmarkStart w:id="17" w:name="related-work"/>
     <w:p>
       <w:pPr>
         <w:pStyle w:val="Heading2"/>
       </w:pPr>
       <w:r>
-        <w:rPr>
-          <w:rStyle w:val="SectionNumber"/>
-        </w:rPr>
-        <w:t xml:space="preserve">1.3</w:t>
-      </w:r>
-      <w:r>
-        <w:tab/>
-      </w:r>
-      <w:r>
         <w:t xml:space="preserve">2. Related Work</w:t>
       </w:r>
     </w:p>
-    <w:bookmarkStart w:id="14" w:name="building-energy-forecasting"/>
+    <w:bookmarkStart w:id="14" w:name="X3418c62447dcd4bdc90c3921769004a34f60a9f"/>
     <w:p>
       <w:pPr>
         <w:pStyle w:val="Heading3"/>
       </w:pPr>
       <w:r>
-        <w:rPr>
-          <w:rStyle w:val="SectionNumber"/>
-        </w:rPr>
-        <w:t xml:space="preserve">1.3.1</w:t>
-      </w:r>
-      <w:r>
-        <w:tab/>
-      </w:r>
-      <w:r>
-        <w:t xml:space="preserve">2.1 Building Energy Forecasting</w:t>
+        <w:t xml:space="preserve">2.1 Building Energy Forecasting and Zero-Shot Transfer</w:t>
       </w:r>
     </w:p>
     <w:p>
@@ -379,26 +305,25 @@
         <w:pStyle w:val="FirstParagraph"/>
       </w:pPr>
       <w:r>
-        <w:t xml:space="preserve">Prior methods ranging from statistical models [9] to gradient boosting [10], recurrent networks [11], and Transformers [12, 13] improved per-building accuracy but remained building-specific. Transfer learning through domain adaptation [14] and fine-tuning [15] relaxes this constraint but still requires target-domain data. Our work eliminates the need for target-building data through zero-shot inference, while demonstrating that the training corpus can be radically smaller than previously assumed.</w:t>
+        <w:t xml:space="preserve">Building energy forecasting has progressed from statistical models (Amasyali and El-Gohary 2018) through gradient boosting (Chen and Guestrin 2016), recurrent networks (Hochreiter and Schmidhuber 1997), and Transformers (Vaswani et al. 2017; Nie et al. 2023). These methods achieve high per-building accuracy but require target-building training data. Transfer learning through domain adaptation (Ribeiro et al. 2018) and fine-tuning (Spencer et al. 2025) relaxes this constraint but still needs target-domain samples.</w:t>
+      </w:r>
+    </w:p>
+    <w:p>
+      <w:pPr>
+        <w:pStyle w:val="BodyText"/>
+      </w:pPr>
+      <w:r>
+        <w:t xml:space="preserve">The zero-shot paradigm eliminates target-building data entirely: a model trained on synthetic simulations generalizes to unseen real buildings at inference time. Emami et al. (2023) operationalized this through a 900K-building corpus drawn from the NREL EULP pipeline (Wilson et al. 2022), training a Transformer with Gaussian NLL loss for approximately 0.067 epochs—roughly 2–3 sampled windows per building—using global Box-Cox normalization (λ = −0.067). The sub-epoch training regime is consequential: additional training degraded out-of-distribution performance, which the authors interpreted as evidence that the model memorizes synthetic patterns faster than it learns transferable representations. This observation is consistent with the Operational Diversity Hypothesis—the useful information may be learned quickly because many buildings produce similar temporal patterns.</w:t>
       </w:r>
     </w:p>
     <w:bookmarkEnd w:id="14"/>
-    <w:bookmarkStart w:id="15" w:name="buildingsbench-and-the-scale-paradigm"/>
+    <w:bookmarkStart w:id="15" w:name="Xfc579718b257d6ded2dabcb64f97448d0bf102a"/>
     <w:p>
       <w:pPr>
         <w:pStyle w:val="Heading3"/>
       </w:pPr>
       <w:r>
-        <w:rPr>
-          <w:rStyle w:val="SectionNumber"/>
-        </w:rPr>
-        <w:t xml:space="preserve">1.3.2</w:t>
-      </w:r>
-      <w:r>
-        <w:tab/>
-      </w:r>
-      <w:r>
-        <w:t xml:space="preserve">2.2 BuildingsBench and the Scale Paradigm</w:t>
+        <w:t xml:space="preserve">2.2 Scaling Laws and Data Efficiency in Time Series</w:t>
       </w:r>
     </w:p>
     <w:p>
@@ -406,7 +331,25 @@
         <w:pStyle w:val="FirstParagraph"/>
       </w:pPr>
       <w:r>
-        <w:t xml:space="preserve">BuildingsBench [3] framed building load forecasting as a zero-shot generalization problem. The training corpus, Buildings-900K, comprises approximately 350,000 commercial (ComStock) and 550,000 residential (ResStock) synthetic buildings generated by the NREL EULP pipeline [4]. The model trains for approximately 0.067 epochs—roughly 2–3 sampled training windows per building—using fitted global Box-Cox normalization (λ = −0.067). The sub-epoch training regime is consequential: the authors found that additional training degraded OOD performance, interpreted as evidence that the model memorizes synthetic patterns faster than it learns transferable representations.</w:t>
+        <w:t xml:space="preserve">The proliferation of general-purpose time series foundation models—TimesFM (Das et al. 2024), Chronos (Ansari et al. 2024), Lag-Llama (Rasul et al. 2023), MOIRAI (Woo et al. 2024)—has established that large-scale pretraining enables zero-shot forecasting across domains. Yao et al. (2025) found that model architecture significantly influences scaling efficiency. Most relevant to our work, Shi et al. (2024) showed that in time series, additional data does not expand the combinatorial coverage of contexts as directly as additional tokens do in language modeling. Our findings provide a concrete, domain-specific instance of this principle: in building energy, the marginal information content of additional stock-model buildings decreases rapidly because they occupy similar regions of operational schedule space.</w:t>
+      </w:r>
+    </w:p>
+    <w:bookmarkEnd w:id="15"/>
+    <w:bookmarkStart w:id="16" w:name="Xd790703d2075ebb5f0512f308963f39fa15357f"/>
+    <w:p>
+      <w:pPr>
+        <w:pStyle w:val="Heading3"/>
+      </w:pPr>
+      <w:r>
+        <w:t xml:space="preserve">2.3 Data-Centric AI and Instance Normalization</w:t>
+      </w:r>
+    </w:p>
+    <w:p>
+      <w:pPr>
+        <w:pStyle w:val="FirstParagraph"/>
+      </w:pPr>
+      <w:r>
+        <w:t xml:space="preserve">The data-centric AI perspective (Zha et al. 2023) holds that improving data quality is often more productive than improving model architecture. Our 12-dimensional LHS design applies this principle to the energy domain: rather than sampling from a fixed distribution, we construct a training set that fills the space of plausible operations.</w:t>
       </w:r>
     </w:p>
     <w:p>
@@ -414,69 +357,7 @@
         <w:pStyle w:val="BodyText"/>
       </w:pPr>
       <w:r>
-        <w:t xml:space="preserve">Our work keeps the model architecture and evaluation protocol fixed while changing the training data and normalization strategy. The comparison tests whether the same architecture can achieve comparable performance with a fundamentally different—and radically smaller—training corpus.</w:t>
-      </w:r>
-    </w:p>
-    <w:bookmarkEnd w:id="15"/>
-    <w:bookmarkStart w:id="16" w:name="Xfc579718b257d6ded2dabcb64f97448d0bf102a"/>
-    <w:p>
-      <w:pPr>
-        <w:pStyle w:val="Heading3"/>
-      </w:pPr>
-      <w:r>
-        <w:rPr>
-          <w:rStyle w:val="SectionNumber"/>
-        </w:rPr>
-        <w:t xml:space="preserve">1.3.3</w:t>
-      </w:r>
-      <w:r>
-        <w:tab/>
-      </w:r>
-      <w:r>
-        <w:t xml:space="preserve">2.3 Scaling Laws and Data Efficiency in Time Series</w:t>
-      </w:r>
-    </w:p>
-    <w:p>
-      <w:pPr>
-        <w:pStyle w:val="FirstParagraph"/>
-      </w:pPr>
-      <w:r>
-        <w:t xml:space="preserve">The proliferation of general-purpose time series foundation models—TimesFM [16], Chronos [17], Lag-Llama [18], MOIRAI [19]—has established that large-scale pretraining enables zero-shot forecasting across domains. Yao et al. [20] found that model architecture significantly influences scaling efficiency. Most relevant to our work, Shi et al. [5] showed that in time series, additional data does not expand the combinatorial coverage of contexts as directly as additional tokens do in language modeling. Our findings provide a concrete, domain-specific instance of this principle: in building energy, the marginal information content of additional stock-model buildings decreases rapidly because they occupy similar regions of operational schedule space.</w:t>
-      </w:r>
-    </w:p>
-    <w:bookmarkEnd w:id="16"/>
-    <w:bookmarkStart w:id="17" w:name="Xd790703d2075ebb5f0512f308963f39fa15357f"/>
-    <w:p>
-      <w:pPr>
-        <w:pStyle w:val="Heading3"/>
-      </w:pPr>
-      <w:r>
-        <w:rPr>
-          <w:rStyle w:val="SectionNumber"/>
-        </w:rPr>
-        <w:t xml:space="preserve">1.3.4</w:t>
-      </w:r>
-      <w:r>
-        <w:tab/>
-      </w:r>
-      <w:r>
-        <w:t xml:space="preserve">2.4 Data-Centric AI and Instance Normalization</w:t>
-      </w:r>
-    </w:p>
-    <w:p>
-      <w:pPr>
-        <w:pStyle w:val="FirstParagraph"/>
-      </w:pPr>
-      <w:r>
-        <w:t xml:space="preserve">The data-centric AI perspective [7] holds that improving data quality is often more productive than improving model architecture. Our 12-dimensional LHS design applies this principle to the energy domain: rather than sampling from a fixed distribution, we construct a training set that fills the space of plausible operations.</w:t>
-      </w:r>
-    </w:p>
-    <w:p>
-      <w:pPr>
-        <w:pStyle w:val="BodyText"/>
-      </w:pPr>
-      <w:r>
-        <w:t xml:space="preserve">RevIN [8] normalizes instance-level load magnitude and variability before the encoder and restores the scale after prediction. Our finding that RevIN’s benefit is regime-dependent—helpful for small diverse datasets, harmful at large scale—extends the understanding of when instance normalization helps versus hurts, connecting to broader questions about the role of magnitude information in time series models.</w:t>
+        <w:t xml:space="preserve">RevIN (Kim et al. 2022) normalizes instance-level load magnitude and variability before the encoder and restores the scale after prediction. Our finding that RevIN’s benefit is regime-dependent—helpful for small diverse datasets, harmful at large scale—extends the understanding of when instance normalization helps versus hurts, connecting to broader questions about the role of magnitude information in time series models.</w:t>
       </w:r>
     </w:p>
     <w:p>
@@ -486,41 +367,23 @@
         </w:pict>
       </w:r>
     </w:p>
+    <w:bookmarkEnd w:id="16"/>
     <w:bookmarkEnd w:id="17"/>
-    <w:bookmarkEnd w:id="18"/>
-    <w:bookmarkStart w:id="23" w:name="method"/>
+    <w:bookmarkStart w:id="22" w:name="method"/>
     <w:p>
       <w:pPr>
         <w:pStyle w:val="Heading2"/>
       </w:pPr>
       <w:r>
-        <w:rPr>
-          <w:rStyle w:val="SectionNumber"/>
-        </w:rPr>
-        <w:t xml:space="preserve">1.4</w:t>
-      </w:r>
-      <w:r>
-        <w:tab/>
-      </w:r>
-      <w:r>
         <w:t xml:space="preserve">3. Method</w:t>
       </w:r>
     </w:p>
-    <w:bookmarkStart w:id="19" w:name="X53f09caf6ce5c13676432cf601fa7e81395f8e3"/>
+    <w:bookmarkStart w:id="18" w:name="X53f09caf6ce5c13676432cf601fa7e81395f8e3"/>
     <w:p>
       <w:pPr>
         <w:pStyle w:val="Heading3"/>
       </w:pPr>
       <w:r>
-        <w:rPr>
-          <w:rStyle w:val="SectionNumber"/>
-        </w:rPr>
-        <w:t xml:space="preserve">1.4.1</w:t>
-      </w:r>
-      <w:r>
-        <w:tab/>
-      </w:r>
-      <w:r>
         <w:t xml:space="preserve">3.1 Parametric Building Simulation with LHS-Designed Operational Diversity</w:t>
       </w:r>
     </w:p>
@@ -529,7 +392,7 @@
         <w:pStyle w:val="FirstParagraph"/>
       </w:pPr>
       <w:r>
-        <w:t xml:space="preserve">Training data are generated through EnergyPlus [21] simulation of commercial buildings with parametrically varied operational schedules. The goal is not to replicate a building stock distribution but to maximize the coverage of the temporal pattern space.</w:t>
+        <w:t xml:space="preserve">Training data are generated through EnergyPlus (Crawley et al. 2001) simulation of commercial buildings with parametrically varied operational schedules. The goal is not to replicate a building stock distribution but to promote broad coverage of the temporal pattern space.</w:t>
       </w:r>
     </w:p>
     <w:p>
@@ -547,7 +410,7 @@
         <w:t xml:space="preserve"> </w:t>
       </w:r>
       <w:r>
-        <w:t xml:space="preserve">We use 14 building archetypes based on DOE commercial reference building models [22] adapted to Korean building codes and climate zones: office, retail, school, hotel, hospital, apartment (midrise and highrise), small office, large office, warehouse, strip mall, restaurant (full-service and quick-service), and university. Each archetype begins from a DOE reference model with code-compliant envelope thermal properties, HVAC system sizing, and internal load densities.</w:t>
+        <w:t xml:space="preserve">We use 14 building archetypes based on DOE commercial reference building models (Deru et al. 2011) adapted to Korean building codes and climate zones: office, retail, school, hotel, hospital, apartment (midrise and highrise), small office, large office, warehouse, strip mall, restaurant (full-service and quick-service), and university. Each archetype begins from a DOE reference model with code-compliant envelope thermal properties, HVAC system sizing, and internal load densities.</w:t>
       </w:r>
     </w:p>
     <w:p>
@@ -583,7 +446,7 @@
         <w:t xml:space="preserve"> </w:t>
       </w:r>
       <w:r>
-        <w:t xml:space="preserve">Building operational schedules are parameterized by 12 continuous variables sampled via Latin Hypercube Sampling [23] (Table 1). Unlike stock-model sampling—which reflects the statistical distribution of real buildings (many near typical conditions, few at extremes)—LHS ensures uniform marginal coverage across all dimensions. Stock-model sampling asks</w:t>
+        <w:t xml:space="preserve">Building operational schedules are parameterized by 12 continuous variables sampled via Latin Hypercube Sampling (McKay et al. 1979) (Table 1). Unlike stock-model sampling—which reflects the statistical distribution of real buildings (many near typical conditions, few at extremes)—LHS ensures uniform marginal coverage across all dimensions. Stock-model sampling asks</w:t>
       </w:r>
       <w:r>
         <w:t xml:space="preserve"> </w:t>
@@ -1094,7 +957,7 @@
         <w:pStyle w:val="BodyText"/>
       </w:pPr>
       <w:r>
-        <w:t xml:space="preserve">The resulting training set ranges from 24/7 high-baseload facilities (resembling data centers or hospitals) to weekday-only offices with steep morning ramps and low overnight loads. For the n = 50 configuration used in our main experiments, this yields 50 × 14 = 700 buildings. Each sample modifies the EnergyPlus IDF file, runs a full annual simulation (8,760 hours), and extracts hourly total electricity consumption.</w:t>
+        <w:t xml:space="preserve">The resulting training set ranges from 24/7 high-baseload facilities (resembling data centers or hospitals) to weekday-only offices with steep morning ramps and low overnight loads. For the n = 50 configuration used in our main experiments, this yields 50 × 14 = 700 buildings. Each sample modifies the EnergyPlus IDF file, runs a full annual simulation (8,760 hours), and extracts hourly total electricity consumption. The end-to-end pipeline—from archetype selection through LHS sampling, simulation, normalization, and zero-shot inference—is illustrated in Fig. 1.</w:t>
       </w:r>
     </w:p>
     <w:p>
@@ -1112,7 +975,7 @@
         <w:t xml:space="preserve"> </w:t>
       </w:r>
       <w:r>
-        <w:t xml:space="preserve">Table 2 provides a post-hoc comparison showing that including the four diversity parameters (night_equipment_frac, weekly_break_prob, seasonal_amplitude, process_load_frac) brings simulated profiles closer to real-building statistics. These statistics were computed after defining the parameter space and were not used for model selection or hyperparameter tuning.</w:t>
+        <w:t xml:space="preserve">Table 2 provides a post-hoc comparison showing that including the four diversity parameters (night_equipment_frac, weekly_break_prob, seasonal_amplitude, process_load_frac) moves several key profile statistics toward the range observed in real buildings, although not uniformly across all metrics. These statistics were computed after defining the parameter space and were not used for model selection or hyperparameter tuning. The overshoot in baseload P95 and CV P5 reflects the LHS design’s intent to cover extreme high-baseload and low-variability regimes rather than to match the empirical stock distribution.</w:t>
       </w:r>
     </w:p>
     <w:p>
@@ -1192,7 +1055,7 @@
               <w:jc w:val="center"/>
             </w:pPr>
             <w:r>
-              <w:t xml:space="preserve">BB Real Buildings</w:t>
+              <w:t xml:space="preserve">Real Buildings*</w:t>
             </w:r>
           </w:p>
         </w:tc>
@@ -1394,22 +1257,21 @@
         </w:tc>
       </w:tr>
     </w:tbl>
-    <w:bookmarkEnd w:id="19"/>
-    <w:bookmarkStart w:id="20" w:name="model-architecture"/>
+    <w:p>
+      <w:pPr>
+        <w:pStyle w:val="BodyText"/>
+      </w:pPr>
+      <w:r>
+        <w:t xml:space="preserve">*Real Buildings = the 955-building evaluation set from the BuildingsBench benchmark (Emami et al. 2023).</w:t>
+      </w:r>
+    </w:p>
+    <w:bookmarkEnd w:id="18"/>
+    <w:bookmarkStart w:id="19" w:name="model-architecture"/>
     <w:p>
       <w:pPr>
         <w:pStyle w:val="Heading3"/>
       </w:pPr>
       <w:r>
-        <w:rPr>
-          <w:rStyle w:val="SectionNumber"/>
-        </w:rPr>
-        <w:t xml:space="preserve">1.4.2</w:t>
-      </w:r>
-      <w:r>
-        <w:tab/>
-      </w:r>
-      <w:r>
         <w:t xml:space="preserve">3.2 Model Architecture</w:t>
       </w:r>
     </w:p>
@@ -1418,7 +1280,7 @@
         <w:pStyle w:val="FirstParagraph"/>
       </w:pPr>
       <w:r>
-        <w:t xml:space="preserve">To isolate the effect of training data from model design, we adopt the identical Transformer architecture used in BuildingsBench [3]: 3 encoder and 3 decoder layers, d_model = 512, 8 attention heads, feedforward dimension 1024, totaling 15.8M parameters (Transformer-M). Input consists of 168 hourly load values with temporal features (day-of-year sinusoidal encoding, day-of-week and hour-of-day embeddings). The model predicts 24-hour-ahead Gaussian distributions through autoregressive decoding with Gaussian NLL loss.</w:t>
+        <w:t xml:space="preserve">We use a standard encoder-decoder Transformer: 3 encoder and 3 decoder layers, d_model = 512, 8 attention heads, feedforward dimension 1024, totaling 15.8M parameters (Transformer-M). Input consists of 168 hourly load values with temporal features (day-of-year sinusoidal encoding, day-of-week and hour-of-day embeddings). The model predicts 24-hour-ahead Gaussian distributions through autoregressive decoding with Gaussian NLL loss. Using the same Transformer backbone as Emami et al. (2023) minimizes model-capacity confounds in the controlled comparisons.</w:t>
       </w:r>
     </w:p>
     <w:p>
@@ -1436,7 +1298,7 @@
         <w:t xml:space="preserve"> </w:t>
       </w:r>
       <w:r>
-        <w:t xml:space="preserve">Before encoding, the 168-hour context window is normalized by its instance mean and standard deviation; after decoding, the normalization is reversed. This removes building-specific load magnitude and variability, allowing the model to focus on temporal shape. We apply RevIN symmetrically in all controlled experiments, including BuildingsBench baselines, to ensure fair comparison. The comparison between our RevIN-equipped model and the original BuildingsBench (which does not use RevIN) is discussed in Section 5.1.</w:t>
+        <w:t xml:space="preserve">Before encoding, the 168-hour context window is normalized by its instance mean and standard deviation; after decoding, the normalization is reversed. This removes building-specific load magnitude and variability, allowing the model to focus on temporal shape. We apply RevIN symmetrically in all controlled experiments, including stock-model baselines, to ensure fair comparison. The comparison with the original stock-model pipeline (which does not use RevIN) is discussed in Section 5.1.</w:t>
       </w:r>
     </w:p>
     <w:p>
@@ -1454,26 +1316,43 @@
         <w:t xml:space="preserve"> </w:t>
       </w:r>
       <w:r>
-        <w:t xml:space="preserve">BuildingsBench provides latitude and longitude embeddings as model inputs. We set both to zero for all buildings—both training and evaluation. The ablation in Section 4.4 shows that actual Korean coordinates provide no benefit when evaluation coordinates are unavailable, consistent with RevIN absorbing the scale differences that coordinates might otherwise encode.</w:t>
+        <w:t xml:space="preserve">Some zero-shot approaches provide latitude and longitude embeddings as model inputs. We set both to zero for all buildings—both training and evaluation—to test whether operational diversity alone suffices for generalization. The ablation in Section 4.4 confirms that actual coordinates provide no benefit, consistent with RevIN absorbing the scale differences that coordinates might otherwise encode.</w:t>
+      </w:r>
+    </w:p>
+    <w:bookmarkEnd w:id="19"/>
+    <w:bookmarkStart w:id="20" w:name="training-protocol"/>
+    <w:p>
+      <w:pPr>
+        <w:pStyle w:val="Heading3"/>
+      </w:pPr>
+      <w:r>
+        <w:t xml:space="preserve">3.3 Training Protocol</w:t>
+      </w:r>
+    </w:p>
+    <w:p>
+      <w:pPr>
+        <w:pStyle w:val="FirstParagraph"/>
+      </w:pPr>
+      <w:r>
+        <w:t xml:space="preserve">We apply a global Box-Cox transform (Box and Cox 1964) fitted on our simulation data (λ = −0.067). AdamW (Loshchilov and Hutter 2019) with learning rate 6 × 10⁻⁵, weight decay 0.01, cosine annealing, and 500-step warmup. Training runs for 18,000 gradient steps with batch size 128, corresponding to approximately 9 epochs over 700 buildings. Data augmentation includes window jitter (±1–6h), Gaussian noise (σ = 0.02 in Box-Cox space), and amplitude scaling (U[0.85, 1.15]).</w:t>
+      </w:r>
+    </w:p>
+    <w:p>
+      <w:pPr>
+        <w:pStyle w:val="BodyText"/>
+      </w:pPr>
+      <w:r>
+        <w:t xml:space="preserve">With 700 buildings and 18,000 steps, each building is seen roughly 3,300 times across window positions—in contrast to the stock-model baseline, where each of 900K buildings contributes roughly 2–3 windows. Three factors mitigate overfitting despite this repeated exposure: (1) augmentation ensures each exposure presents a different view; (2) RevIN prevents memorizing absolute load levels; (3) the high inter-building diversity from LHS ensures patterns learned from any one building generalize.</w:t>
       </w:r>
     </w:p>
     <w:bookmarkEnd w:id="20"/>
-    <w:bookmarkStart w:id="21" w:name="training-protocol"/>
+    <w:bookmarkStart w:id="21" w:name="evaluation-protocol"/>
     <w:p>
       <w:pPr>
         <w:pStyle w:val="Heading3"/>
       </w:pPr>
       <w:r>
-        <w:rPr>
-          <w:rStyle w:val="SectionNumber"/>
-        </w:rPr>
-        <w:t xml:space="preserve">1.4.3</w:t>
-      </w:r>
-      <w:r>
-        <w:tab/>
-      </w:r>
-      <w:r>
-        <w:t xml:space="preserve">3.3 Training Protocol</w:t>
+        <w:t xml:space="preserve">3.4 Evaluation Protocol</w:t>
       </w:r>
     </w:p>
     <w:p>
@@ -1481,42 +1360,7 @@
         <w:pStyle w:val="FirstParagraph"/>
       </w:pPr>
       <w:r>
-        <w:t xml:space="preserve">We apply a global Box-Cox transform [24] fitted on our simulation data (λ = −0.067). AdamW [25] with learning rate 6 × 10⁻⁵, weight decay 0.01, cosine annealing, and 500-step warmup. Training runs for 18,000 gradient steps with batch size 128, corresponding to approximately 9 epochs over 700 buildings. Data augmentation includes window jitter (±1–6h), Gaussian noise (σ = 0.02 in Box-Cox space), and amplitude scaling (U[0.85, 1.15]).</w:t>
-      </w:r>
-    </w:p>
-    <w:p>
-      <w:pPr>
-        <w:pStyle w:val="BodyText"/>
-      </w:pPr>
-      <w:r>
-        <w:t xml:space="preserve">Both our training and BuildingsBench use approximately 18,000 gradient steps, but distributed differently: each of our 700 buildings is seen roughly 3,300 times (across window positions), while each BuildingsBench building contributes roughly 2–3 windows. Three factors mitigate overfitting: (1) augmentation ensures each exposure presents a different view; (2) RevIN prevents memorizing absolute load levels; (3) the high inter-building diversity of LHS ensures patterns learned from any one building generalize.</w:t>
-      </w:r>
-    </w:p>
-    <w:bookmarkEnd w:id="21"/>
-    <w:bookmarkStart w:id="22" w:name="evaluation-protocol"/>
-    <w:p>
-      <w:pPr>
-        <w:pStyle w:val="Heading3"/>
-      </w:pPr>
-      <w:r>
-        <w:rPr>
-          <w:rStyle w:val="SectionNumber"/>
-        </w:rPr>
-        <w:t xml:space="preserve">1.4.4</w:t>
-      </w:r>
-      <w:r>
-        <w:tab/>
-      </w:r>
-      <w:r>
-        <w:t xml:space="preserve">3.4 Evaluation Protocol</w:t>
-      </w:r>
-    </w:p>
-    <w:p>
-      <w:pPr>
-        <w:pStyle w:val="FirstParagraph"/>
-      </w:pPr>
-      <w:r>
-        <w:t xml:space="preserve">We follow the BuildingsBench test set, sliding-window construction, and aggregation metric without modification. The test set comprises 955 real load series: 611 from U.S. commercial buildings in the Building Data Genome Project 2 (BDG-2) [26], drawn from four university and government campuses spanning Mediterranean, semi-arid, humid subtropical, and humid continental climates, and 344 from Portuguese electricity consumers [27], with 15 out-of-vocabulary buildings excluded per the original specification. Per-building NRMSE = sqrt(MSE) / mean(actual), aggregated by median across buildings. The sliding window uses stride 24 hours, context 168 hours, and prediction horizon 24 hours. We reproduced the BuildingsBench baseline using the official checkpoint and obtained 13.27%, confirming pipeline equivalence within 0.01 pp of the reported 13.28%.</w:t>
+        <w:t xml:space="preserve">We evaluate on a standardized real-building test set of 955 commercial load series (Emami et al. 2023): 611 from U.S. commercial buildings in the Building Data Genome Project 2 (BDG-2) (Miller et al. 2020), drawn from four university and government campuses spanning Mediterranean, semi-arid, humid subtropical, and humid continental climates, and 344 from Portuguese electricity consumers (Trindade 2015), with 15 out-of-vocabulary buildings excluded per the original specification. Per-building NRMSE = sqrt(MSE) / mean(actual), aggregated by median across buildings. The sliding window uses stride 24 hours, context 168 hours, and prediction horizon 24 hours. We reproduced the stock-model baseline using the official checkpoint and obtained 13.27%, confirming pipeline equivalence within 0.01 pp of the reported 13.28%.</w:t>
       </w:r>
     </w:p>
     <w:p>
@@ -1526,42 +1370,24 @@
         </w:pict>
       </w:r>
     </w:p>
+    <w:bookmarkEnd w:id="21"/>
     <w:bookmarkEnd w:id="22"/>
-    <w:bookmarkEnd w:id="23"/>
-    <w:bookmarkStart w:id="28" w:name="experiments-and-results"/>
+    <w:bookmarkStart w:id="27" w:name="experiments-and-results"/>
     <w:p>
       <w:pPr>
         <w:pStyle w:val="Heading2"/>
       </w:pPr>
       <w:r>
-        <w:rPr>
-          <w:rStyle w:val="SectionNumber"/>
-        </w:rPr>
-        <w:t xml:space="preserve">1.5</w:t>
-      </w:r>
-      <w:r>
-        <w:tab/>
-      </w:r>
-      <w:r>
         <w:t xml:space="preserve">4. Experiments and Results</w:t>
       </w:r>
     </w:p>
-    <w:bookmarkStart w:id="24" w:name="X2ce7ecfddbeb2b731a4f83f883e1b366d61a64e"/>
+    <w:bookmarkStart w:id="23" w:name="X59b85218671b774ad361f42a56af218922339fe"/>
     <w:p>
       <w:pPr>
         <w:pStyle w:val="Heading3"/>
       </w:pPr>
       <w:r>
-        <w:rPr>
-          <w:rStyle w:val="SectionNumber"/>
-        </w:rPr>
-        <w:t xml:space="preserve">1.5.1</w:t>
-      </w:r>
-      <w:r>
-        <w:tab/>
-      </w:r>
-      <w:r>
-        <w:t xml:space="preserve">4.1 Equal-Scale Comparison: Isolating the Data-Design Effect</w:t>
+        <w:t xml:space="preserve">4.1 Equal-Scale Controlled Validation of Simulation Design</w:t>
       </w:r>
     </w:p>
     <w:p>
@@ -1569,7 +1395,7 @@
         <w:pStyle w:val="FirstParagraph"/>
       </w:pPr>
       <w:r>
-        <w:t xml:space="preserve">The central experiment compares two 700-building corpora under identical training conditions, isolating data design as the independent variable (Table 3, Fig. 2).</w:t>
+        <w:t xml:space="preserve">The central experiment tests whether the proposed simulation design methodology produces more transferable training data than stock-model sampling. Two 700-building datasets are compared under matched training conditions, with simulation data design as the primary variable of interest (Table 3, Fig. 2).</w:t>
       </w:r>
     </w:p>
     <w:p>
@@ -1587,7 +1413,7 @@
         <w:t xml:space="preserve"> </w:t>
       </w:r>
       <w:r>
-        <w:t xml:space="preserve">Main results on the 955-building evaluation set. Korean-700 and US-TMY-700 report five-seed mean ± std; Korean-700 (no aug) and Korean-700 (RevIN OFF) report three-seed mean ± std; all other rows use seed = 42. †BB-900K NCRPS unavailable due to Box-Cox protocol mismatch. BB-700 (aug-matched) uses identical optimizer, augmentation, and steps as Korean-700.</w:t>
+        <w:t xml:space="preserve">External zero-shot validation on real commercial buildings (955-building evaluation set). Korean-700 and US-TMY-700 report five-seed mean ± std; Korean-700 (no aug) and Korean-700 (RevIN OFF) report three-seed mean ± std; all other rows use seed = 42. †BB-900K Normalized Continuous Ranked Probability Score (NCRPS) unavailable due to Box-Cox protocol mismatch. BB-700 (aug-matched) uses identical optimizer, augmentation, and steps as Korean-700. BB denotes the BuildingsBench stock-model corpus (Emami et al. 2023).</w:t>
       </w:r>
     </w:p>
     <w:tbl>
@@ -1598,14 +1424,15 @@
         <w:tblLook w:firstRow="1" w:lastRow="0" w:firstColumn="0" w:lastColumn="0" w:noHBand="0" w:noVBand="0" w:val="0020"/>
       </w:tblPr>
       <w:tblGrid>
-        <w:gridCol w:w="894"/>
-        <w:gridCol w:w="766"/>
-        <w:gridCol w:w="894"/>
-        <w:gridCol w:w="894"/>
-        <w:gridCol w:w="638"/>
-        <w:gridCol w:w="1405"/>
-        <w:gridCol w:w="1405"/>
-        <w:gridCol w:w="1021"/>
+        <w:gridCol w:w="815"/>
+        <w:gridCol w:w="698"/>
+        <w:gridCol w:w="698"/>
+        <w:gridCol w:w="815"/>
+        <w:gridCol w:w="815"/>
+        <w:gridCol w:w="582"/>
+        <w:gridCol w:w="1281"/>
+        <w:gridCol w:w="1281"/>
+        <w:gridCol w:w="931"/>
       </w:tblGrid>
       <w:tr>
         <w:trPr>
@@ -1629,6 +1456,17 @@
               <w:pStyle w:val="Compact"/>
             </w:pPr>
             <w:r>
+              <w:t xml:space="preserve">Role</w:t>
+            </w:r>
+          </w:p>
+        </w:tc>
+        <w:tc>
+          <w:tcPr/>
+          <w:p>
+            <w:pPr>
+              <w:pStyle w:val="Compact"/>
+            </w:pPr>
+            <w:r>
               <w:t xml:space="preserve">Data</w:t>
             </w:r>
           </w:p>
@@ -1702,198 +1540,6 @@
             </w:pPr>
             <w:r>
               <w:t xml:space="preserve">Δ baseline</w:t>
-            </w:r>
-          </w:p>
-        </w:tc>
-      </w:tr>
-      <w:tr>
-        <w:tc>
-          <w:tcPr/>
-          <w:p>
-            <w:pPr>
-              <w:pStyle w:val="Compact"/>
-            </w:pPr>
-            <w:r>
-              <w:t xml:space="preserve">BB-900K</w:t>
-            </w:r>
-          </w:p>
-        </w:tc>
-        <w:tc>
-          <w:tcPr/>
-          <w:p>
-            <w:pPr>
-              <w:pStyle w:val="Compact"/>
-            </w:pPr>
-            <w:r>
-              <w:t xml:space="preserve">BB 900K</w:t>
-            </w:r>
-          </w:p>
-        </w:tc>
-        <w:tc>
-          <w:tcPr/>
-          <w:p>
-            <w:pPr>
-              <w:pStyle w:val="Compact"/>
-              <w:jc w:val="right"/>
-            </w:pPr>
-            <w:r>
-              <w:t xml:space="preserve">900,000</w:t>
-            </w:r>
-          </w:p>
-        </w:tc>
-        <w:tc>
-          <w:tcPr/>
-          <w:p>
-            <w:pPr>
-              <w:pStyle w:val="Compact"/>
-              <w:jc w:val="center"/>
-            </w:pPr>
-            <w:r>
-              <w:t xml:space="preserve">OFF</w:t>
-            </w:r>
-          </w:p>
-        </w:tc>
-        <w:tc>
-          <w:tcPr/>
-          <w:p>
-            <w:pPr>
-              <w:pStyle w:val="Compact"/>
-              <w:jc w:val="center"/>
-            </w:pPr>
-            <w:r>
-              <w:t xml:space="preserve">OFF</w:t>
-            </w:r>
-          </w:p>
-        </w:tc>
-        <w:tc>
-          <w:tcPr/>
-          <w:p>
-            <w:pPr>
-              <w:pStyle w:val="Compact"/>
-              <w:jc w:val="center"/>
-            </w:pPr>
-            <w:r>
-              <w:t xml:space="preserve">13.27</w:t>
-            </w:r>
-          </w:p>
-        </w:tc>
-        <w:tc>
-          <w:tcPr/>
-          <w:p>
-            <w:pPr>
-              <w:pStyle w:val="Compact"/>
-              <w:jc w:val="center"/>
-            </w:pPr>
-            <w:r>
-              <w:t xml:space="preserve">—†</w:t>
-            </w:r>
-          </w:p>
-        </w:tc>
-        <w:tc>
-          <w:tcPr/>
-          <w:p>
-            <w:pPr>
-              <w:pStyle w:val="Compact"/>
-              <w:jc w:val="center"/>
-            </w:pPr>
-            <w:r>
-              <w:t xml:space="preserve">—</w:t>
-            </w:r>
-          </w:p>
-        </w:tc>
-      </w:tr>
-      <w:tr>
-        <w:tc>
-          <w:tcPr/>
-          <w:p>
-            <w:pPr>
-              <w:pStyle w:val="Compact"/>
-            </w:pPr>
-            <w:r>
-              <w:t xml:space="preserve">BB+RevIN</w:t>
-            </w:r>
-          </w:p>
-        </w:tc>
-        <w:tc>
-          <w:tcPr/>
-          <w:p>
-            <w:pPr>
-              <w:pStyle w:val="Compact"/>
-            </w:pPr>
-            <w:r>
-              <w:t xml:space="preserve">BB 900K</w:t>
-            </w:r>
-          </w:p>
-        </w:tc>
-        <w:tc>
-          <w:tcPr/>
-          <w:p>
-            <w:pPr>
-              <w:pStyle w:val="Compact"/>
-              <w:jc w:val="right"/>
-            </w:pPr>
-            <w:r>
-              <w:t xml:space="preserve">900,000</w:t>
-            </w:r>
-          </w:p>
-        </w:tc>
-        <w:tc>
-          <w:tcPr/>
-          <w:p>
-            <w:pPr>
-              <w:pStyle w:val="Compact"/>
-              <w:jc w:val="center"/>
-            </w:pPr>
-            <w:r>
-              <w:t xml:space="preserve">ON</w:t>
-            </w:r>
-          </w:p>
-        </w:tc>
-        <w:tc>
-          <w:tcPr/>
-          <w:p>
-            <w:pPr>
-              <w:pStyle w:val="Compact"/>
-              <w:jc w:val="center"/>
-            </w:pPr>
-            <w:r>
-              <w:t xml:space="preserve">OFF</w:t>
-            </w:r>
-          </w:p>
-        </w:tc>
-        <w:tc>
-          <w:tcPr/>
-          <w:p>
-            <w:pPr>
-              <w:pStyle w:val="Compact"/>
-              <w:jc w:val="center"/>
-            </w:pPr>
-            <w:r>
-              <w:t xml:space="preserve">13.89</w:t>
-            </w:r>
-          </w:p>
-        </w:tc>
-        <w:tc>
-          <w:tcPr/>
-          <w:p>
-            <w:pPr>
-              <w:pStyle w:val="Compact"/>
-              <w:jc w:val="center"/>
-            </w:pPr>
-            <w:r>
-              <w:t xml:space="preserve">7.76</w:t>
-            </w:r>
-          </w:p>
-        </w:tc>
-        <w:tc>
-          <w:tcPr/>
-          <w:p>
-            <w:pPr>
-              <w:pStyle w:val="Compact"/>
-              <w:jc w:val="center"/>
-            </w:pPr>
-            <w:r>
-              <w:t xml:space="preserve">+0.62</w:t>
             </w:r>
           </w:p>
         </w:tc>
@@ -1925,6 +1571,21 @@
                 <w:b/>
                 <w:bCs/>
               </w:rPr>
+              <w:t xml:space="preserve">Proposed</w:t>
+            </w:r>
+          </w:p>
+        </w:tc>
+        <w:tc>
+          <w:tcPr/>
+          <w:p>
+            <w:pPr>
+              <w:pStyle w:val="Compact"/>
+            </w:pPr>
+            <w:r>
+              <w:rPr>
+                <w:b/>
+                <w:bCs/>
+              </w:rPr>
               <w:t xml:space="preserve">LHS sim</w:t>
             </w:r>
           </w:p>
@@ -2034,294 +1695,6 @@
               <w:pStyle w:val="Compact"/>
             </w:pPr>
             <w:r>
-              <w:t xml:space="preserve">K-700 no aug</w:t>
-            </w:r>
-          </w:p>
-        </w:tc>
-        <w:tc>
-          <w:tcPr/>
-          <w:p>
-            <w:pPr>
-              <w:pStyle w:val="Compact"/>
-            </w:pPr>
-            <w:r>
-              <w:t xml:space="preserve">LHS sim</w:t>
-            </w:r>
-          </w:p>
-        </w:tc>
-        <w:tc>
-          <w:tcPr/>
-          <w:p>
-            <w:pPr>
-              <w:pStyle w:val="Compact"/>
-              <w:jc w:val="right"/>
-            </w:pPr>
-            <w:r>
-              <w:t xml:space="preserve">700</w:t>
-            </w:r>
-          </w:p>
-        </w:tc>
-        <w:tc>
-          <w:tcPr/>
-          <w:p>
-            <w:pPr>
-              <w:pStyle w:val="Compact"/>
-              <w:jc w:val="center"/>
-            </w:pPr>
-            <w:r>
-              <w:t xml:space="preserve">ON</w:t>
-            </w:r>
-          </w:p>
-        </w:tc>
-        <w:tc>
-          <w:tcPr/>
-          <w:p>
-            <w:pPr>
-              <w:pStyle w:val="Compact"/>
-              <w:jc w:val="center"/>
-            </w:pPr>
-            <w:r>
-              <w:t xml:space="preserve">OFF</w:t>
-            </w:r>
-          </w:p>
-        </w:tc>
-        <w:tc>
-          <w:tcPr/>
-          <w:p>
-            <w:pPr>
-              <w:pStyle w:val="Compact"/>
-              <w:jc w:val="center"/>
-            </w:pPr>
-            <w:r>
-              <w:t xml:space="preserve">13.67 ± 0.21</w:t>
-            </w:r>
-          </w:p>
-        </w:tc>
-        <w:tc>
-          <w:tcPr/>
-          <w:p>
-            <w:pPr>
-              <w:pStyle w:val="Compact"/>
-              <w:jc w:val="center"/>
-            </w:pPr>
-            <w:r>
-              <w:t xml:space="preserve">8.16</w:t>
-            </w:r>
-          </w:p>
-        </w:tc>
-        <w:tc>
-          <w:tcPr/>
-          <w:p>
-            <w:pPr>
-              <w:pStyle w:val="Compact"/>
-              <w:jc w:val="center"/>
-            </w:pPr>
-            <w:r>
-              <w:t xml:space="preserve">+0.40</w:t>
-            </w:r>
-          </w:p>
-        </w:tc>
-      </w:tr>
-      <w:tr>
-        <w:tc>
-          <w:tcPr/>
-          <w:p>
-            <w:pPr>
-              <w:pStyle w:val="Compact"/>
-            </w:pPr>
-            <w:r>
-              <w:t xml:space="preserve">K-700 no RevIN</w:t>
-            </w:r>
-          </w:p>
-        </w:tc>
-        <w:tc>
-          <w:tcPr/>
-          <w:p>
-            <w:pPr>
-              <w:pStyle w:val="Compact"/>
-            </w:pPr>
-            <w:r>
-              <w:t xml:space="preserve">LHS sim</w:t>
-            </w:r>
-          </w:p>
-        </w:tc>
-        <w:tc>
-          <w:tcPr/>
-          <w:p>
-            <w:pPr>
-              <w:pStyle w:val="Compact"/>
-              <w:jc w:val="right"/>
-            </w:pPr>
-            <w:r>
-              <w:t xml:space="preserve">700</w:t>
-            </w:r>
-          </w:p>
-        </w:tc>
-        <w:tc>
-          <w:tcPr/>
-          <w:p>
-            <w:pPr>
-              <w:pStyle w:val="Compact"/>
-              <w:jc w:val="center"/>
-            </w:pPr>
-            <w:r>
-              <w:t xml:space="preserve">OFF</w:t>
-            </w:r>
-          </w:p>
-        </w:tc>
-        <w:tc>
-          <w:tcPr/>
-          <w:p>
-            <w:pPr>
-              <w:pStyle w:val="Compact"/>
-              <w:jc w:val="center"/>
-            </w:pPr>
-            <w:r>
-              <w:t xml:space="preserve">ON</w:t>
-            </w:r>
-          </w:p>
-        </w:tc>
-        <w:tc>
-          <w:tcPr/>
-          <w:p>
-            <w:pPr>
-              <w:pStyle w:val="Compact"/>
-              <w:jc w:val="center"/>
-            </w:pPr>
-            <w:r>
-              <w:t xml:space="preserve">14.72 ± 0.28</w:t>
-            </w:r>
-          </w:p>
-        </w:tc>
-        <w:tc>
-          <w:tcPr/>
-          <w:p>
-            <w:pPr>
-              <w:pStyle w:val="Compact"/>
-              <w:jc w:val="center"/>
-            </w:pPr>
-            <w:r>
-              <w:t xml:space="preserve">8.29</w:t>
-            </w:r>
-          </w:p>
-        </w:tc>
-        <w:tc>
-          <w:tcPr/>
-          <w:p>
-            <w:pPr>
-              <w:pStyle w:val="Compact"/>
-              <w:jc w:val="center"/>
-            </w:pPr>
-            <w:r>
-              <w:t xml:space="preserve">+1.45</w:t>
-            </w:r>
-          </w:p>
-        </w:tc>
-      </w:tr>
-      <w:tr>
-        <w:tc>
-          <w:tcPr/>
-          <w:p>
-            <w:pPr>
-              <w:pStyle w:val="Compact"/>
-            </w:pPr>
-            <w:r>
-              <w:t xml:space="preserve">BB-700 aug</w:t>
-            </w:r>
-          </w:p>
-        </w:tc>
-        <w:tc>
-          <w:tcPr/>
-          <w:p>
-            <w:pPr>
-              <w:pStyle w:val="Compact"/>
-            </w:pPr>
-            <w:r>
-              <w:t xml:space="preserve">BB subset</w:t>
-            </w:r>
-          </w:p>
-        </w:tc>
-        <w:tc>
-          <w:tcPr/>
-          <w:p>
-            <w:pPr>
-              <w:pStyle w:val="Compact"/>
-              <w:jc w:val="right"/>
-            </w:pPr>
-            <w:r>
-              <w:t xml:space="preserve">700</w:t>
-            </w:r>
-          </w:p>
-        </w:tc>
-        <w:tc>
-          <w:tcPr/>
-          <w:p>
-            <w:pPr>
-              <w:pStyle w:val="Compact"/>
-              <w:jc w:val="center"/>
-            </w:pPr>
-            <w:r>
-              <w:t xml:space="preserve">ON</w:t>
-            </w:r>
-          </w:p>
-        </w:tc>
-        <w:tc>
-          <w:tcPr/>
-          <w:p>
-            <w:pPr>
-              <w:pStyle w:val="Compact"/>
-              <w:jc w:val="center"/>
-            </w:pPr>
-            <w:r>
-              <w:t xml:space="preserve">ON</w:t>
-            </w:r>
-          </w:p>
-        </w:tc>
-        <w:tc>
-          <w:tcPr/>
-          <w:p>
-            <w:pPr>
-              <w:pStyle w:val="Compact"/>
-              <w:jc w:val="center"/>
-            </w:pPr>
-            <w:r>
-              <w:t xml:space="preserve">14.26</w:t>
-            </w:r>
-          </w:p>
-        </w:tc>
-        <w:tc>
-          <w:tcPr/>
-          <w:p>
-            <w:pPr>
-              <w:pStyle w:val="Compact"/>
-              <w:jc w:val="center"/>
-            </w:pPr>
-            <w:r>
-              <w:t xml:space="preserve">7.80</w:t>
-            </w:r>
-          </w:p>
-        </w:tc>
-        <w:tc>
-          <w:tcPr/>
-          <w:p>
-            <w:pPr>
-              <w:pStyle w:val="Compact"/>
-              <w:jc w:val="center"/>
-            </w:pPr>
-            <w:r>
-              <w:t xml:space="preserve">+0.99</w:t>
-            </w:r>
-          </w:p>
-        </w:tc>
-      </w:tr>
-      <w:tr>
-        <w:tc>
-          <w:tcPr/>
-          <w:p>
-            <w:pPr>
-              <w:pStyle w:val="Compact"/>
-            </w:pPr>
-            <w:r>
               <w:rPr>
                 <w:b/>
                 <w:bCs/>
@@ -2341,6 +1714,21 @@
                 <w:b/>
                 <w:bCs/>
               </w:rPr>
+              <w:t xml:space="preserve">Weather ablation</w:t>
+            </w:r>
+          </w:p>
+        </w:tc>
+        <w:tc>
+          <w:tcPr/>
+          <w:p>
+            <w:pPr>
+              <w:pStyle w:val="Compact"/>
+            </w:pPr>
+            <w:r>
+              <w:rPr>
+                <w:b/>
+                <w:bCs/>
+              </w:rPr>
               <w:t xml:space="preserve">US TMY sim</w:t>
             </w:r>
           </w:p>
@@ -2450,6 +1838,327 @@
               <w:pStyle w:val="Compact"/>
             </w:pPr>
             <w:r>
+              <w:t xml:space="preserve">K-700 no aug</w:t>
+            </w:r>
+          </w:p>
+        </w:tc>
+        <w:tc>
+          <w:tcPr/>
+          <w:p>
+            <w:pPr>
+              <w:pStyle w:val="Compact"/>
+            </w:pPr>
+            <w:r>
+              <w:t xml:space="preserve">Aug ablation</w:t>
+            </w:r>
+          </w:p>
+        </w:tc>
+        <w:tc>
+          <w:tcPr/>
+          <w:p>
+            <w:pPr>
+              <w:pStyle w:val="Compact"/>
+            </w:pPr>
+            <w:r>
+              <w:t xml:space="preserve">LHS sim</w:t>
+            </w:r>
+          </w:p>
+        </w:tc>
+        <w:tc>
+          <w:tcPr/>
+          <w:p>
+            <w:pPr>
+              <w:pStyle w:val="Compact"/>
+              <w:jc w:val="right"/>
+            </w:pPr>
+            <w:r>
+              <w:t xml:space="preserve">700</w:t>
+            </w:r>
+          </w:p>
+        </w:tc>
+        <w:tc>
+          <w:tcPr/>
+          <w:p>
+            <w:pPr>
+              <w:pStyle w:val="Compact"/>
+              <w:jc w:val="center"/>
+            </w:pPr>
+            <w:r>
+              <w:t xml:space="preserve">ON</w:t>
+            </w:r>
+          </w:p>
+        </w:tc>
+        <w:tc>
+          <w:tcPr/>
+          <w:p>
+            <w:pPr>
+              <w:pStyle w:val="Compact"/>
+              <w:jc w:val="center"/>
+            </w:pPr>
+            <w:r>
+              <w:t xml:space="preserve">OFF</w:t>
+            </w:r>
+          </w:p>
+        </w:tc>
+        <w:tc>
+          <w:tcPr/>
+          <w:p>
+            <w:pPr>
+              <w:pStyle w:val="Compact"/>
+              <w:jc w:val="center"/>
+            </w:pPr>
+            <w:r>
+              <w:t xml:space="preserve">13.67 ± 0.21</w:t>
+            </w:r>
+          </w:p>
+        </w:tc>
+        <w:tc>
+          <w:tcPr/>
+          <w:p>
+            <w:pPr>
+              <w:pStyle w:val="Compact"/>
+              <w:jc w:val="center"/>
+            </w:pPr>
+            <w:r>
+              <w:t xml:space="preserve">8.16</w:t>
+            </w:r>
+          </w:p>
+        </w:tc>
+        <w:tc>
+          <w:tcPr/>
+          <w:p>
+            <w:pPr>
+              <w:pStyle w:val="Compact"/>
+              <w:jc w:val="center"/>
+            </w:pPr>
+            <w:r>
+              <w:t xml:space="preserve">+0.40</w:t>
+            </w:r>
+          </w:p>
+        </w:tc>
+      </w:tr>
+      <w:tr>
+        <w:tc>
+          <w:tcPr/>
+          <w:p>
+            <w:pPr>
+              <w:pStyle w:val="Compact"/>
+            </w:pPr>
+            <w:r>
+              <w:t xml:space="preserve">K-700 no RevIN</w:t>
+            </w:r>
+          </w:p>
+        </w:tc>
+        <w:tc>
+          <w:tcPr/>
+          <w:p>
+            <w:pPr>
+              <w:pStyle w:val="Compact"/>
+            </w:pPr>
+            <w:r>
+              <w:t xml:space="preserve">RevIN ablation</w:t>
+            </w:r>
+          </w:p>
+        </w:tc>
+        <w:tc>
+          <w:tcPr/>
+          <w:p>
+            <w:pPr>
+              <w:pStyle w:val="Compact"/>
+            </w:pPr>
+            <w:r>
+              <w:t xml:space="preserve">LHS sim</w:t>
+            </w:r>
+          </w:p>
+        </w:tc>
+        <w:tc>
+          <w:tcPr/>
+          <w:p>
+            <w:pPr>
+              <w:pStyle w:val="Compact"/>
+              <w:jc w:val="right"/>
+            </w:pPr>
+            <w:r>
+              <w:t xml:space="preserve">700</w:t>
+            </w:r>
+          </w:p>
+        </w:tc>
+        <w:tc>
+          <w:tcPr/>
+          <w:p>
+            <w:pPr>
+              <w:pStyle w:val="Compact"/>
+              <w:jc w:val="center"/>
+            </w:pPr>
+            <w:r>
+              <w:t xml:space="preserve">OFF</w:t>
+            </w:r>
+          </w:p>
+        </w:tc>
+        <w:tc>
+          <w:tcPr/>
+          <w:p>
+            <w:pPr>
+              <w:pStyle w:val="Compact"/>
+              <w:jc w:val="center"/>
+            </w:pPr>
+            <w:r>
+              <w:t xml:space="preserve">ON</w:t>
+            </w:r>
+          </w:p>
+        </w:tc>
+        <w:tc>
+          <w:tcPr/>
+          <w:p>
+            <w:pPr>
+              <w:pStyle w:val="Compact"/>
+              <w:jc w:val="center"/>
+            </w:pPr>
+            <w:r>
+              <w:t xml:space="preserve">14.72 ± 0.28</w:t>
+            </w:r>
+          </w:p>
+        </w:tc>
+        <w:tc>
+          <w:tcPr/>
+          <w:p>
+            <w:pPr>
+              <w:pStyle w:val="Compact"/>
+              <w:jc w:val="center"/>
+            </w:pPr>
+            <w:r>
+              <w:t xml:space="preserve">8.29</w:t>
+            </w:r>
+          </w:p>
+        </w:tc>
+        <w:tc>
+          <w:tcPr/>
+          <w:p>
+            <w:pPr>
+              <w:pStyle w:val="Compact"/>
+              <w:jc w:val="center"/>
+            </w:pPr>
+            <w:r>
+              <w:t xml:space="preserve">+1.45</w:t>
+            </w:r>
+          </w:p>
+        </w:tc>
+      </w:tr>
+      <w:tr>
+        <w:tc>
+          <w:tcPr/>
+          <w:p>
+            <w:pPr>
+              <w:pStyle w:val="Compact"/>
+            </w:pPr>
+            <w:r>
+              <w:t xml:space="preserve">BB-700 aug</w:t>
+            </w:r>
+          </w:p>
+        </w:tc>
+        <w:tc>
+          <w:tcPr/>
+          <w:p>
+            <w:pPr>
+              <w:pStyle w:val="Compact"/>
+            </w:pPr>
+            <w:r>
+              <w:t xml:space="preserve">Equal-size control</w:t>
+            </w:r>
+          </w:p>
+        </w:tc>
+        <w:tc>
+          <w:tcPr/>
+          <w:p>
+            <w:pPr>
+              <w:pStyle w:val="Compact"/>
+            </w:pPr>
+            <w:r>
+              <w:t xml:space="preserve">BB subset</w:t>
+            </w:r>
+          </w:p>
+        </w:tc>
+        <w:tc>
+          <w:tcPr/>
+          <w:p>
+            <w:pPr>
+              <w:pStyle w:val="Compact"/>
+              <w:jc w:val="right"/>
+            </w:pPr>
+            <w:r>
+              <w:t xml:space="preserve">700</w:t>
+            </w:r>
+          </w:p>
+        </w:tc>
+        <w:tc>
+          <w:tcPr/>
+          <w:p>
+            <w:pPr>
+              <w:pStyle w:val="Compact"/>
+              <w:jc w:val="center"/>
+            </w:pPr>
+            <w:r>
+              <w:t xml:space="preserve">ON</w:t>
+            </w:r>
+          </w:p>
+        </w:tc>
+        <w:tc>
+          <w:tcPr/>
+          <w:p>
+            <w:pPr>
+              <w:pStyle w:val="Compact"/>
+              <w:jc w:val="center"/>
+            </w:pPr>
+            <w:r>
+              <w:t xml:space="preserve">ON</w:t>
+            </w:r>
+          </w:p>
+        </w:tc>
+        <w:tc>
+          <w:tcPr/>
+          <w:p>
+            <w:pPr>
+              <w:pStyle w:val="Compact"/>
+              <w:jc w:val="center"/>
+            </w:pPr>
+            <w:r>
+              <w:t xml:space="preserve">14.26</w:t>
+            </w:r>
+          </w:p>
+        </w:tc>
+        <w:tc>
+          <w:tcPr/>
+          <w:p>
+            <w:pPr>
+              <w:pStyle w:val="Compact"/>
+              <w:jc w:val="center"/>
+            </w:pPr>
+            <w:r>
+              <w:t xml:space="preserve">7.80</w:t>
+            </w:r>
+          </w:p>
+        </w:tc>
+        <w:tc>
+          <w:tcPr/>
+          <w:p>
+            <w:pPr>
+              <w:pStyle w:val="Compact"/>
+              <w:jc w:val="center"/>
+            </w:pPr>
+            <w:r>
+              <w:t xml:space="preserve">+0.99</w:t>
+            </w:r>
+          </w:p>
+        </w:tc>
+      </w:tr>
+      <w:tr>
+        <w:tc>
+          <w:tcPr/>
+          <w:p>
+            <w:pPr>
+              <w:pStyle w:val="Compact"/>
+            </w:pPr>
+            <w:r>
               <w:t xml:space="preserve">BB-700</w:t>
             </w:r>
           </w:p>
@@ -2461,6 +2170,17 @@
               <w:pStyle w:val="Compact"/>
             </w:pPr>
             <w:r>
+              <w:t xml:space="preserve">Control (no aug)</w:t>
+            </w:r>
+          </w:p>
+        </w:tc>
+        <w:tc>
+          <w:tcPr/>
+          <w:p>
+            <w:pPr>
+              <w:pStyle w:val="Compact"/>
+            </w:pPr>
+            <w:r>
               <w:t xml:space="preserve">BB subset</w:t>
             </w:r>
           </w:p>
@@ -2546,18 +2266,29 @@
               <w:pStyle w:val="Compact"/>
             </w:pPr>
             <w:r>
-              <w:t xml:space="preserve">BB-700 OFF</w:t>
-            </w:r>
-          </w:p>
-        </w:tc>
-        <w:tc>
-          <w:tcPr/>
-          <w:p>
-            <w:pPr>
-              <w:pStyle w:val="Compact"/>
-            </w:pPr>
-            <w:r>
-              <w:t xml:space="preserve">BB subset</w:t>
+              <w:t xml:space="preserve">BB-900K</w:t>
+            </w:r>
+          </w:p>
+        </w:tc>
+        <w:tc>
+          <w:tcPr/>
+          <w:p>
+            <w:pPr>
+              <w:pStyle w:val="Compact"/>
+            </w:pPr>
+            <w:r>
+              <w:t xml:space="preserve">External reference</w:t>
+            </w:r>
+          </w:p>
+        </w:tc>
+        <w:tc>
+          <w:tcPr/>
+          <w:p>
+            <w:pPr>
+              <w:pStyle w:val="Compact"/>
+            </w:pPr>
+            <w:r>
+              <w:t xml:space="preserve">BB 900K</w:t>
             </w:r>
           </w:p>
         </w:tc>
@@ -2569,7 +2300,7 @@
               <w:jc w:val="right"/>
             </w:pPr>
             <w:r>
-              <w:t xml:space="preserve">700</w:t>
+              <w:t xml:space="preserve">900,000</w:t>
             </w:r>
           </w:p>
         </w:tc>
@@ -2605,7 +2336,19 @@
               <w:jc w:val="center"/>
             </w:pPr>
             <w:r>
-              <w:t xml:space="preserve">16.44</w:t>
+              <w:t xml:space="preserve">13.27</w:t>
+            </w:r>
+          </w:p>
+        </w:tc>
+        <w:tc>
+          <w:tcPr/>
+          <w:p>
+            <w:pPr>
+              <w:pStyle w:val="Compact"/>
+              <w:jc w:val="center"/>
+            </w:pPr>
+            <w:r>
+              <w:t xml:space="preserve">—†</w:t>
             </w:r>
           </w:p>
         </w:tc>
@@ -2621,15 +2364,110 @@
             </w:r>
           </w:p>
         </w:tc>
-        <w:tc>
-          <w:tcPr/>
-          <w:p>
-            <w:pPr>
-              <w:pStyle w:val="Compact"/>
-              <w:jc w:val="center"/>
-            </w:pPr>
-            <w:r>
-              <w:t xml:space="preserve">+3.17</w:t>
+      </w:tr>
+      <w:tr>
+        <w:tc>
+          <w:tcPr/>
+          <w:p>
+            <w:pPr>
+              <w:pStyle w:val="Compact"/>
+            </w:pPr>
+            <w:r>
+              <w:t xml:space="preserve">BB+RevIN</w:t>
+            </w:r>
+          </w:p>
+        </w:tc>
+        <w:tc>
+          <w:tcPr/>
+          <w:p>
+            <w:pPr>
+              <w:pStyle w:val="Compact"/>
+            </w:pPr>
+            <w:r>
+              <w:t xml:space="preserve">Ref. + RevIN</w:t>
+            </w:r>
+          </w:p>
+        </w:tc>
+        <w:tc>
+          <w:tcPr/>
+          <w:p>
+            <w:pPr>
+              <w:pStyle w:val="Compact"/>
+            </w:pPr>
+            <w:r>
+              <w:t xml:space="preserve">BB 900K</w:t>
+            </w:r>
+          </w:p>
+        </w:tc>
+        <w:tc>
+          <w:tcPr/>
+          <w:p>
+            <w:pPr>
+              <w:pStyle w:val="Compact"/>
+              <w:jc w:val="right"/>
+            </w:pPr>
+            <w:r>
+              <w:t xml:space="preserve">900,000</w:t>
+            </w:r>
+          </w:p>
+        </w:tc>
+        <w:tc>
+          <w:tcPr/>
+          <w:p>
+            <w:pPr>
+              <w:pStyle w:val="Compact"/>
+              <w:jc w:val="center"/>
+            </w:pPr>
+            <w:r>
+              <w:t xml:space="preserve">ON</w:t>
+            </w:r>
+          </w:p>
+        </w:tc>
+        <w:tc>
+          <w:tcPr/>
+          <w:p>
+            <w:pPr>
+              <w:pStyle w:val="Compact"/>
+              <w:jc w:val="center"/>
+            </w:pPr>
+            <w:r>
+              <w:t xml:space="preserve">OFF</w:t>
+            </w:r>
+          </w:p>
+        </w:tc>
+        <w:tc>
+          <w:tcPr/>
+          <w:p>
+            <w:pPr>
+              <w:pStyle w:val="Compact"/>
+              <w:jc w:val="center"/>
+            </w:pPr>
+            <w:r>
+              <w:t xml:space="preserve">13.89</w:t>
+            </w:r>
+          </w:p>
+        </w:tc>
+        <w:tc>
+          <w:tcPr/>
+          <w:p>
+            <w:pPr>
+              <w:pStyle w:val="Compact"/>
+              <w:jc w:val="center"/>
+            </w:pPr>
+            <w:r>
+              <w:t xml:space="preserve">7.76</w:t>
+            </w:r>
+          </w:p>
+        </w:tc>
+        <w:tc>
+          <w:tcPr/>
+          <w:p>
+            <w:pPr>
+              <w:pStyle w:val="Compact"/>
+              <w:jc w:val="center"/>
+            </w:pPr>
+            <w:r>
+              <w:t xml:space="preserve">+0.62</w:t>
             </w:r>
           </w:p>
         </w:tc>
@@ -2653,6 +2491,17 @@
               <w:pStyle w:val="Compact"/>
             </w:pPr>
             <w:r>
+              <w:t xml:space="preserve">Naive baseline</w:t>
+            </w:r>
+          </w:p>
+        </w:tc>
+        <w:tc>
+          <w:tcPr/>
+          <w:p>
+            <w:pPr>
+              <w:pStyle w:val="Compact"/>
+            </w:pPr>
+            <w:r>
               <w:t xml:space="preserve">—</w:t>
             </w:r>
           </w:p>
@@ -2736,7 +2585,7 @@
         <w:pStyle w:val="BodyText"/>
       </w:pPr>
       <w:r>
-        <w:t xml:space="preserve">The equal-scale comparison is the critical test of the Operational Diversity Hypothesis. Under identical conditions (same architecture, same optimizer, same augmentation, same number of buildings, same RevIN), the LHS-designed corpus outperforms the stock-model sample by</w:t>
+        <w:t xml:space="preserve">The equal-scale comparison provides evidence for the central claim of the proposed methodology: that deliberate design of operational diversity can produce more transferable training data than sampling from a fixed stock-model distribution. Under matched conditions (same architecture, same optimizer, same augmentation, same number of buildings, same RevIN), the LHS-designed corpus outperforms the stock-model sample by</w:t>
       </w:r>
       <w:r>
         <w:t xml:space="preserve"> </w:t>
@@ -2752,7 +2601,7 @@
         <w:t xml:space="preserve"> </w:t>
       </w:r>
       <w:r>
-        <w:t xml:space="preserve">at seed 42 (12.93% vs. 14.26%). Since BB-700 aug is a single-seed result, the fairest comparison uses seed-matched values; across all conditions, the data-design gap consistently exceeds 1 pp. This gap cannot be attributed to RevIN, augmentation, model architecture, or training budget—all are controlled. The remaining variable is the design of the training data.</w:t>
+        <w:t xml:space="preserve">at seed 42 (12.93% vs. 14.26%). Although the stock-model control (BB-700 aug) was not evaluated across multiple seeds, the 1.33 pp gap is substantially larger than the observed inter-seed variation of Korean-700 (±0.17 pp), suggesting that the advantage is unlikely to be explained solely by seed noise. Even without augmentation, Korean-700 (13.67%) outperforms the aug-matched stock-model control by 0.59 pp, and the U.S.-weather variant (13.64%) by 0.62 pp—smaller but directionally consistent advantages. Because RevIN, augmentation, model architecture, and training budget are matched, the gap is unlikely to be explained by these factors. The primary remaining difference is the design and source of the training data, although uncontrolled factors such as building codes, envelope properties, and climate mapping cannot be fully excluded (Section 5.4).</w:t>
       </w:r>
     </w:p>
     <w:p>
@@ -2760,26 +2609,35 @@
         <w:pStyle w:val="BodyText"/>
       </w:pPr>
       <w:r>
-        <w:t xml:space="preserve">Korean-700 (five-seed mean 13.11 ± 0.17%) numerically matches the full BB-900K baseline (13.27%), achieving comparable accuracy with 1,286× fewer buildings and no geographic metadata. A paired per-building comparison (Korean-700 five-seed average vs. BB-900K) shows Korean-700 achieves lower error on 680 of 955 buildings (71%); paired bootstrap 95% CI of the median difference is [0.31, 0.39] pp in favor of Korean-700 (Wilcoxon signed-rank p &lt; 0.001).</w:t>
+        <w:t xml:space="preserve">As a secondary observation, the designed dataset achieves performance comparable to the large stock-model reference (five-seed mean 13.11 ± 0.17% vs. 13.27%) without geographic metadata. A paired per-building comparison shows Korean-700 achieves lower error on 680 of 955 buildings (71%); the paired bootstrap 95% CI of the median per-building NRMSE difference is [0.31, 0.39] pp (Wilcoxon signed-rank p &lt; 0.001). This per-building paired effect is larger than the 0.16 pp gap between aggregate medians because paired differencing removes inter-building variance.</w:t>
+      </w:r>
+    </w:p>
+    <w:bookmarkEnd w:id="23"/>
+    <w:bookmarkStart w:id="24" w:name="weather-origin-ablation"/>
+    <w:p>
+      <w:pPr>
+        <w:pStyle w:val="Heading3"/>
+      </w:pPr>
+      <w:r>
+        <w:t xml:space="preserve">4.2 Weather-Origin Ablation</w:t>
+      </w:r>
+    </w:p>
+    <w:p>
+      <w:pPr>
+        <w:pStyle w:val="FirstParagraph"/>
+      </w:pPr>
+      <w:r>
+        <w:t xml:space="preserve">To test whether the observed benefit depends on the Korean weather files, we retrained on the same 700 LHS-designed buildings using U.S. TMY weather (Seoul → Washington DC, Busan → Atlanta, Daegu → Charlotte, Gangneung → Boston, Jeju → Miami). The five-seed mean of US-TMY-700 is 13.64 ± 0.65%, within 0.53 pp of Korean-700. The U.S.-TMY model still outperforms the equal-scale stock-model control (14.26%) by 0.62 pp, suggesting that schedule design remains beneficial after replacing the Korean weather files with approximately matched U.S. TMY files. The higher seed variance (0.65% vs. 0.17%) indicates that weather choice affects run-to-run stability.</w:t>
       </w:r>
     </w:p>
     <w:bookmarkEnd w:id="24"/>
-    <w:bookmarkStart w:id="25" w:name="X5cbf4799c3a65e5c21b6182e6203c3bc0a11f5a"/>
+    <w:bookmarkStart w:id="25" w:name="X981a3d4b8baefdfd750951c85aaffc165c3abc7"/>
     <w:p>
       <w:pPr>
         <w:pStyle w:val="Heading3"/>
       </w:pPr>
       <w:r>
-        <w:rPr>
-          <w:rStyle w:val="SectionNumber"/>
-        </w:rPr>
-        <w:t xml:space="preserve">1.5.2</w:t>
-      </w:r>
-      <w:r>
-        <w:tab/>
-      </w:r>
-      <w:r>
-        <w:t xml:space="preserve">4.2 Climate Ablation: Isolating Schedule Diversity from Weather</w:t>
+        <w:t xml:space="preserve">4.3 N-Scaling: Evidence for Pattern-Count-Governed Learning</w:t>
       </w:r>
     </w:p>
     <w:p>
@@ -2787,34 +2645,7 @@
         <w:pStyle w:val="FirstParagraph"/>
       </w:pPr>
       <w:r>
-        <w:t xml:space="preserve">To isolate schedule diversity from climate effects, we retrained on the same 700 LHS-designed buildings using U.S. TMY weather (Seoul → Washington DC, Busan → Atlanta, Daegu → Charlotte, Gangneung → Boston, Jeju → Miami). The five-seed mean of US-TMY-700 is 13.64 ± 0.65%, within 0.53 pp of Korean-700. The U.S.-TMY model still outperforms BB-700 (14.26%) by 0.62 pp, demonstrating that LHS-designed schedule diversity contributes substantially beyond climate origin. The higher seed variance (0.65% vs. 0.17%) indicates that weather choice affects run-to-run stability.</w:t>
-      </w:r>
-    </w:p>
-    <w:bookmarkEnd w:id="25"/>
-    <w:bookmarkStart w:id="26" w:name="X981a3d4b8baefdfd750951c85aaffc165c3abc7"/>
-    <w:p>
-      <w:pPr>
-        <w:pStyle w:val="Heading3"/>
-      </w:pPr>
-      <w:r>
-        <w:rPr>
-          <w:rStyle w:val="SectionNumber"/>
-        </w:rPr>
-        <w:t xml:space="preserve">1.5.3</w:t>
-      </w:r>
-      <w:r>
-        <w:tab/>
-      </w:r>
-      <w:r>
-        <w:t xml:space="preserve">4.3 N-Scaling: Evidence for Pattern-Count-Governed Learning</w:t>
-      </w:r>
-    </w:p>
-    <w:p>
-      <w:pPr>
-        <w:pStyle w:val="FirstParagraph"/>
-      </w:pPr>
-      <w:r>
-        <w:t xml:space="preserve">If the Operational Diversity Hypothesis is correct, performance should saturate once the LHS parameter space is adequately covered, regardless of further increases in sample count. Table 4 and Fig. 3 test this prediction.</w:t>
+        <w:t xml:space="preserve">If the Operational Diversity Hypothesis is correct, performance should show diminishing returns once the LHS parameter space is adequately covered. Table 4 and Fig. 3 test this prediction.</w:t>
       </w:r>
     </w:p>
     <w:p>
@@ -3306,7 +3137,7 @@
         <w:pStyle w:val="BodyText"/>
       </w:pPr>
       <w:r>
-        <w:t xml:space="preserve">Performance improves sharply from n = 1 to n = 5 (14.72% to 13.28%), matching the BB-900K baseline (13.27%) at just 70 buildings. Beyond n = 5, gains become incremental—fluctuations within ±0.15 pp rather than systematic improvement. This saturation profile is qualitatively different from the monotonic improvement predicted by power-law scaling and is consistent with a learning regime governed by the number of distinct temporal patterns rather than the number of examples.</w:t>
+        <w:t xml:space="preserve">Under the fixed 18,000-step training budget, performance improves sharply from n = 1 to n = 5 (14.72% to 13.28%), plateauing near the external reference level (13.27%) from n ≈ 5 onward. Beyond this point, gains become incremental—fluctuations within ±0.35 pp rather than clear monotonic improvement—consistent with the interpretation that the designed parameter space has been adequately covered. The best single-seed result (12.93% at n = 50) falls within this plateau, suggesting that additional samples refine existing patterns rather than introducing qualitatively new ones.</w:t>
       </w:r>
     </w:p>
     <w:p>
@@ -3314,31 +3145,30 @@
         <w:pStyle w:val="BodyText"/>
       </w:pPr>
       <w:r>
-        <w:t xml:space="preserve">The contrast with BuildingsBench scaling is instructive (Appendix B): increasing from 700 to 7,000 stock-model buildings improves NRMSE by only 0.78 pp (15.28% to 14.50%), and even BB-7K does not approach 700 LHS-designed buildings (13.11%). Adding more stock-model buildings provides diminishing returns because they occupy similar regions of operational space.</w:t>
-      </w:r>
-    </w:p>
-    <w:bookmarkEnd w:id="26"/>
-    <w:bookmarkStart w:id="27" w:name="ablation-studies"/>
+        <w:t xml:space="preserve">The contrast with stock-model scaling is instructive (Appendix B): increasing from 700 to 7,000 stock-model buildings improves NRMSE by only 0.78 pp (15.28% to 14.50%), and even 7,000 stock-model buildings do not approach 700 LHS-designed buildings (13.11%). This is consistent with the interpretation that additional stock-model buildings occupy similar regions of operational space.</w:t>
+      </w:r>
+    </w:p>
+    <w:bookmarkEnd w:id="25"/>
+    <w:bookmarkStart w:id="26" w:name="ablation-studies"/>
     <w:p>
       <w:pPr>
         <w:pStyle w:val="Heading3"/>
       </w:pPr>
       <w:r>
-        <w:rPr>
-          <w:rStyle w:val="SectionNumber"/>
-        </w:rPr>
-        <w:t xml:space="preserve">1.5.4</w:t>
-      </w:r>
-      <w:r>
-        <w:tab/>
-      </w:r>
-      <w:r>
         <w:t xml:space="preserve">4.4 Ablation Studies</w:t>
       </w:r>
     </w:p>
     <w:p>
       <w:pPr>
         <w:pStyle w:val="FirstParagraph"/>
+      </w:pPr>
+      <w:r>
+        <w:t xml:space="preserve">Table 5 reports ablations for RevIN and geographic metadata, using seed-42 for consistent comparison.</w:t>
+      </w:r>
+    </w:p>
+    <w:p>
+      <w:pPr>
+        <w:pStyle w:val="BodyText"/>
       </w:pPr>
       <w:r>
         <w:rPr>
@@ -3351,7 +3181,7 @@
         <w:t xml:space="preserve"> </w:t>
       </w:r>
       <w:r>
-        <w:t xml:space="preserve">Ablation results (val_best checkpoint, 955 buildings).</w:t>
+        <w:t xml:space="preserve">Ablation results (seed 42, val_best checkpoint, 955 buildings).</w:t>
       </w:r>
     </w:p>
     <w:tbl>
@@ -3461,55 +3291,55 @@
               <w:pStyle w:val="Compact"/>
             </w:pPr>
             <w:r>
-              <w:t xml:space="preserve">Best seed (seed 42, lat/lon = zero)</w:t>
-            </w:r>
-          </w:p>
-        </w:tc>
-      </w:tr>
-      <w:tr>
-        <w:tc>
-          <w:tcPr/>
-          <w:p>
-            <w:pPr>
-              <w:pStyle w:val="Compact"/>
-            </w:pPr>
-            <w:r>
-              <w:t xml:space="preserve">RevIN OFF (3-seed mean)</w:t>
-            </w:r>
-          </w:p>
-        </w:tc>
-        <w:tc>
-          <w:tcPr/>
-          <w:p>
-            <w:pPr>
-              <w:pStyle w:val="Compact"/>
-              <w:jc w:val="center"/>
-            </w:pPr>
-            <w:r>
-              <w:t xml:space="preserve">14.72</w:t>
-            </w:r>
-          </w:p>
-        </w:tc>
-        <w:tc>
-          <w:tcPr/>
-          <w:p>
-            <w:pPr>
-              <w:pStyle w:val="Compact"/>
-              <w:jc w:val="center"/>
-            </w:pPr>
-            <w:r>
-              <w:t xml:space="preserve">+1.79</w:t>
-            </w:r>
-          </w:p>
-        </w:tc>
-        <w:tc>
-          <w:tcPr/>
-          <w:p>
-            <w:pPr>
-              <w:pStyle w:val="Compact"/>
-            </w:pPr>
-            <w:r>
-              <w:t xml:space="preserve">RevIN contributes 1.79 pp</w:t>
+              <w:t xml:space="preserve">Seed 42, lat/lon = zero</w:t>
+            </w:r>
+          </w:p>
+        </w:tc>
+      </w:tr>
+      <w:tr>
+        <w:tc>
+          <w:tcPr/>
+          <w:p>
+            <w:pPr>
+              <w:pStyle w:val="Compact"/>
+            </w:pPr>
+            <w:r>
+              <w:t xml:space="preserve">K-700 RevIN OFF</w:t>
+            </w:r>
+          </w:p>
+        </w:tc>
+        <w:tc>
+          <w:tcPr/>
+          <w:p>
+            <w:pPr>
+              <w:pStyle w:val="Compact"/>
+              <w:jc w:val="center"/>
+            </w:pPr>
+            <w:r>
+              <w:t xml:space="preserve">14.81</w:t>
+            </w:r>
+          </w:p>
+        </w:tc>
+        <w:tc>
+          <w:tcPr/>
+          <w:p>
+            <w:pPr>
+              <w:pStyle w:val="Compact"/>
+              <w:jc w:val="center"/>
+            </w:pPr>
+            <w:r>
+              <w:t xml:space="preserve">+1.88</w:t>
+            </w:r>
+          </w:p>
+        </w:tc>
+        <w:tc>
+          <w:tcPr/>
+          <w:p>
+            <w:pPr>
+              <w:pStyle w:val="Compact"/>
+            </w:pPr>
+            <w:r>
+              <w:t xml:space="preserve">RevIN contributes 1.88 pp (seed 42); 1.6 pp across multi-seed means (Appendix A)</w:t>
             </w:r>
           </w:p>
         </w:tc>
@@ -3568,7 +3398,7 @@
         <w:pStyle w:val="BodyText"/>
       </w:pPr>
       <w:r>
-        <w:t xml:space="preserve">Additional ablations (Appendix C) show that using BB-fitted Box-Cox parameters (+3.31 pp), extended training (+3.09 pp), scaling to 70K buildings with fixed budget (+2.42 pp), and seasonal decomposition before RevIN (+3.72 pp) all degrade performance, each illustrating a distinct failure mode.</w:t>
+        <w:t xml:space="preserve">Additional ablations (Appendix C) show that using stock-model-fitted Box-Cox parameters (+3.31 pp), extended training (+3.09 pp), scaling to 70K buildings with fixed budget (+2.42 pp), and seasonal decomposition before RevIN (+3.72 pp) all degrade performance, each illustrating a distinct failure mode.</w:t>
       </w:r>
     </w:p>
     <w:p>
@@ -3578,42 +3408,66 @@
         </w:pict>
       </w:r>
     </w:p>
+    <w:bookmarkEnd w:id="26"/>
     <w:bookmarkEnd w:id="27"/>
+    <w:bookmarkStart w:id="32" w:name="discussion"/>
+    <w:p>
+      <w:pPr>
+        <w:pStyle w:val="Heading2"/>
+      </w:pPr>
+      <w:r>
+        <w:t xml:space="preserve">5. Discussion</w:t>
+      </w:r>
+    </w:p>
+    <w:bookmarkStart w:id="28" w:name="Xcedbb71b774b66f9ba26e7d74f161466e851017"/>
+    <w:p>
+      <w:pPr>
+        <w:pStyle w:val="Heading3"/>
+      </w:pPr>
+      <w:r>
+        <w:t xml:space="preserve">5.1 Mechanistic Interpretation of RevIN’s Regime-Dependent Effect</w:t>
+      </w:r>
+    </w:p>
+    <w:p>
+      <w:pPr>
+        <w:pStyle w:val="FirstParagraph"/>
+      </w:pPr>
+      <w:r>
+        <w:t xml:space="preserve">The asymmetry in RevIN’s effect across dataset scales (Fig. 4) admits a coherent mechanistic interpretation that extends beyond our specific setting.</w:t>
+      </w:r>
+    </w:p>
+    <w:p>
+      <w:pPr>
+        <w:pStyle w:val="BodyText"/>
+      </w:pPr>
+      <w:r>
+        <w:t xml:space="preserve">RevIN normalizes each context window to zero mean and unit variance, stripping absolute load magnitude. With a small LHS-designed dataset, the model has not seen enough magnitude variation to internalize it; RevIN reduces this burden by normalizing instance-level scale and variability, yielding a substantial improvement (Table 5). With a large stock-model corpus—where each building contributes only a few training windows—magnitude may carry transferable information because it is correlated with building type, HVAC configuration, and schedule assumptions in the generation pipeline. Removing this information may discard something useful, producing a measurable degradation (Table 3).</w:t>
+      </w:r>
+    </w:p>
+    <w:p>
+      <w:pPr>
+        <w:pStyle w:val="BodyText"/>
+      </w:pPr>
+      <w:r>
+        <w:t xml:space="preserve">A structural factor reinforces this. In stock-model corpora, magnitude is informative about building type because HVAC, envelope, and schedule are jointly determined by the generation pipeline—magnitude and temporal shape are correlated. In our LHS design, magnitude reflects only the scale_mult parameter, sampled independently of schedule parameters. RevIN’s removal of magnitude therefore discards less useful information in LHS data than in stock-model data.</w:t>
+      </w:r>
+    </w:p>
+    <w:p>
+      <w:pPr>
+        <w:pStyle w:val="BodyText"/>
+      </w:pPr>
+      <w:r>
+        <w:t xml:space="preserve">This finding has implications for the broader time series community: RevIN’s benefit depends not just on dataset size but on the information structure of the training data—specifically, whether magnitude carries predictive information about temporal dynamics.</w:t>
+      </w:r>
+    </w:p>
     <w:bookmarkEnd w:id="28"/>
-    <w:bookmarkStart w:id="33" w:name="discussion"/>
-    <w:p>
-      <w:pPr>
-        <w:pStyle w:val="Heading2"/>
-      </w:pPr>
-      <w:r>
-        <w:rPr>
-          <w:rStyle w:val="SectionNumber"/>
-        </w:rPr>
-        <w:t xml:space="preserve">1.6</w:t>
-      </w:r>
-      <w:r>
-        <w:tab/>
-      </w:r>
-      <w:r>
-        <w:t xml:space="preserve">5. Discussion</w:t>
-      </w:r>
-    </w:p>
-    <w:bookmarkStart w:id="29" w:name="Xa3e279450174adf376093e47a5363cdb021c3b8"/>
+    <w:bookmarkStart w:id="29" w:name="Xc243f20a545997903f5ea1ea4c74a7a2da483b8"/>
     <w:p>
       <w:pPr>
         <w:pStyle w:val="Heading3"/>
       </w:pPr>
       <w:r>
-        <w:rPr>
-          <w:rStyle w:val="SectionNumber"/>
-        </w:rPr>
-        <w:t xml:space="preserve">1.6.1</w:t>
-      </w:r>
-      <w:r>
-        <w:tab/>
-      </w:r>
-      <w:r>
-        <w:t xml:space="preserve">5.1 Mechanistic Explanation: RevIN’s Regime-Dependent Effect</w:t>
+        <w:t xml:space="preserve">5.2 Design Principles Behind Transferable Pattern Coverage</w:t>
       </w:r>
     </w:p>
     <w:p>
@@ -3621,58 +3475,7 @@
         <w:pStyle w:val="FirstParagraph"/>
       </w:pPr>
       <w:r>
-        <w:t xml:space="preserve">The asymmetry in RevIN’s effect across dataset scales (Fig. 4) has a clear mechanistic explanation that extends beyond our specific setting.</w:t>
-      </w:r>
-    </w:p>
-    <w:p>
-      <w:pPr>
-        <w:pStyle w:val="BodyText"/>
-      </w:pPr>
-      <w:r>
-        <w:t xml:space="preserve">RevIN normalizes each context window to zero mean and unit variance, stripping absolute load magnitude. With 700 LHS-designed buildings, the model has not seen enough magnitude variation to internalize it; RevIN solves this analytically, yielding a 1.6 pp improvement. With 900,000 stock-model buildings—each contributing roughly 2–3 training windows—the model has already learned to exploit magnitude as a signal: a building consuming 500 kW at midnight behaves differently from one consuming 5 kW. Removing this information discards something useful, producing a 0.62 pp degradation.</w:t>
-      </w:r>
-    </w:p>
-    <w:p>
-      <w:pPr>
-        <w:pStyle w:val="BodyText"/>
-      </w:pPr>
-      <w:r>
-        <w:t xml:space="preserve">A structural factor reinforces this. In Buildings-900K, magnitude is informative about building type because HVAC, envelope, and schedule are jointly determined by stock-model parameters—magnitude and temporal shape are correlated. In our LHS design, magnitude reflects only the scale_mult parameter, sampled independently of schedule parameters. RevIN’s removal of magnitude therefore discards less useful information in LHS data than in stock-model data.</w:t>
-      </w:r>
-    </w:p>
-    <w:p>
-      <w:pPr>
-        <w:pStyle w:val="BodyText"/>
-      </w:pPr>
-      <w:r>
-        <w:t xml:space="preserve">This finding has implications for the broader time series community: RevIN’s benefit depends not just on dataset size but on the information structure of the training data—specifically, whether magnitude carries predictive information about temporal dynamics.</w:t>
-      </w:r>
-    </w:p>
-    <w:bookmarkEnd w:id="29"/>
-    <w:bookmarkStart w:id="30" w:name="X158f72140ab04445c29d6b514b8f0620605e2d9"/>
-    <w:p>
-      <w:pPr>
-        <w:pStyle w:val="Heading3"/>
-      </w:pPr>
-      <w:r>
-        <w:rPr>
-          <w:rStyle w:val="SectionNumber"/>
-        </w:rPr>
-        <w:t xml:space="preserve">1.6.2</w:t>
-      </w:r>
-      <w:r>
-        <w:tab/>
-      </w:r>
-      <w:r>
-        <w:t xml:space="preserve">5.2 Why Operational Diversity Governs Accuracy</w:t>
-      </w:r>
-    </w:p>
-    <w:p>
-      <w:pPr>
-        <w:pStyle w:val="FirstParagraph"/>
-      </w:pPr>
-      <w:r>
-        <w:t xml:space="preserve">The Operational Diversity Hypothesis provides a parsimonious explanation for four otherwise disconnected observations:</w:t>
+        <w:t xml:space="preserve">The methodology’s effectiveness can be traced to three design principles that together produce a training corpus with high transferability per building.</w:t>
       </w:r>
     </w:p>
     <w:p>
@@ -3687,13 +3490,13 @@
           <w:b/>
           <w:bCs/>
         </w:rPr>
-        <w:t xml:space="preserve">Equal-scale superiority.</w:t>
+        <w:t xml:space="preserve">Independent marginal coverage through LHS.</w:t>
       </w:r>
       <w:r>
         <w:t xml:space="preserve"> </w:t>
       </w:r>
       <w:r>
-        <w:t xml:space="preserve">LHS-700 outperforms BB-700 because LHS achieves broader pattern coverage with fewer buildings. The 12-dimensional design produces buildings spanning the full range of plausible operations, while 700 stock-model buildings cluster around typical conditions.</w:t>
+        <w:t xml:space="preserve">Each of the 12 schedule parameters is sampled with uniform marginal coverage, ensuring that the training set visits the full range of each operational dimension—including extreme combinations (e.g., high baseload with short operating hours) that rarely occur in real building stocks but expose the model to temporal dynamics it must handle at inference time. This helps explain why 700 LHS-designed buildings outperform 700 stock-model buildings under identical conditions: LHS spreads samples across the operational schedule space rather than concentrating them around its mode.</w:t>
       </w:r>
     </w:p>
     <w:p>
@@ -3708,13 +3511,13 @@
           <w:b/>
           <w:bCs/>
         </w:rPr>
-        <w:t xml:space="preserve">Rapid n-scaling saturation.</w:t>
+        <w:t xml:space="preserve">Archetype-stratified diversity.</w:t>
       </w:r>
       <w:r>
         <w:t xml:space="preserve"> </w:t>
       </w:r>
       <w:r>
-        <w:t xml:space="preserve">Performance plateaus at 70 buildings because the LHS parameter space is adequately covered with 5 samples per archetype. Additional samples refine existing patterns rather than introducing new ones.</w:t>
+        <w:t xml:space="preserve">Stratifying the 12D LHS across 14 building archetypes ensures that schedule diversity interacts with distinct thermal mass, HVAC response, and internal gain profiles. This produces a combinatorial expansion of temporal patterns: the same nighttime equipment retention fraction yields qualitatively different load shapes in a hospital versus a strip mall. The n-scaling plateau at a modest number of samples per archetype (Table 4) indicates that this archetype × schedule interaction space is covered with relatively few samples.</w:t>
       </w:r>
     </w:p>
     <w:p>
@@ -3729,34 +3532,13 @@
           <w:b/>
           <w:bCs/>
         </w:rPr>
-        <w:t xml:space="preserve">Sub-epoch optimality in BuildingsBench.</w:t>
+        <w:t xml:space="preserve">Decoupled magnitude and temporal shape.</w:t>
       </w:r>
       <w:r>
         <w:t xml:space="preserve"> </w:t>
       </w:r>
       <w:r>
-        <w:t xml:space="preserve">The finding that BuildingsBench achieves best OOD performance with less than one epoch is consistent with our hypothesis: the useful information in 900K buildings—the distinct temporal patterns—is learned quickly, and further training memorizes stock-model-specific artifacts.</w:t>
-      </w:r>
-    </w:p>
-    <w:p>
-      <w:pPr>
-        <w:numPr>
-          <w:ilvl w:val="0"/>
-          <w:numId w:val="1002"/>
-        </w:numPr>
-      </w:pPr>
-      <w:r>
-        <w:rPr>
-          <w:b/>
-          <w:bCs/>
-        </w:rPr>
-        <w:t xml:space="preserve">Climate robustness.</w:t>
-      </w:r>
-      <w:r>
-        <w:t xml:space="preserve"> </w:t>
-      </w:r>
-      <w:r>
-        <w:t xml:space="preserve">The U.S.-TMY ablation preserves the data-design advantage because operational schedule diversity, not climate-specific features, drives the generalization. Weather affects thermal loads, but the temporal dynamics—operating hours, ramp patterns, baseload levels—are schedule-driven.</w:t>
+        <w:t xml:space="preserve">The scale_mult parameter is sampled independently of the 11 schedule parameters, reducing the extent to which load magnitude encodes schedule-driven temporal dynamics. This structural property helps explain why RevIN—which strips magnitude—helps in our design but hurts in stock-model corpora, where magnitude and schedule are jointly determined by the generation pipeline and therefore correlated.</w:t>
       </w:r>
     </w:p>
     <w:p>
@@ -3764,26 +3546,51 @@
         <w:pStyle w:val="FirstParagraph"/>
       </w:pPr>
       <w:r>
-        <w:t xml:space="preserve">From a scaling-law perspective, this is consistent with Shi et al. [5]: in building load time series, each additional building from the same stock model may add only a variation on patterns already in the training set. The marginal information content decreases rapidly when the operational diversity of the corpus is fixed.</w:t>
+        <w:t xml:space="preserve">These principles also explain why the sub-epoch training regime observed in large-scale stock-model training (Emami et al. 2023) is consistent with our hypothesis: the distinct temporal patterns in a stock-model corpus are learned quickly because many buildings produce similar patterns, and further training memorizes pipeline-specific artifacts rather than learning new dynamics.</w:t>
+      </w:r>
+    </w:p>
+    <w:p>
+      <w:pPr>
+        <w:pStyle w:val="BodyText"/>
+      </w:pPr>
+      <w:r>
+        <w:t xml:space="preserve">From a scaling-law perspective, this aligns with Shi et al. (2024): in building load time series, the marginal information content of additional buildings decreases rapidly when the operational diversity of the corpus is fixed. Our methodology addresses this directly by promoting broad diversity at design time.</w:t>
+      </w:r>
+    </w:p>
+    <w:bookmarkEnd w:id="29"/>
+    <w:bookmarkStart w:id="30" w:name="practical-implications"/>
+    <w:p>
+      <w:pPr>
+        <w:pStyle w:val="Heading3"/>
+      </w:pPr>
+      <w:r>
+        <w:t xml:space="preserve">5.3 Practical Implications</w:t>
+      </w:r>
+    </w:p>
+    <w:p>
+      <w:pPr>
+        <w:pStyle w:val="FirstParagraph"/>
+      </w:pPr>
+      <w:r>
+        <w:t xml:space="preserve">The reframing from scale to design has immediate practical consequences. An organization can generate several hundred parametric EnergyPlus simulations conforming to local building codes and climate, train a standard Transformer with RevIN and augmentation, and deploy zero-shot forecasting—without assembling a national building stock database.</w:t>
+      </w:r>
+    </w:p>
+    <w:p>
+      <w:pPr>
+        <w:pStyle w:val="BodyText"/>
+      </w:pPr>
+      <w:r>
+        <w:t xml:space="preserve">The computational cost is modest: in our implementation, 700 simulations completed in approximately 4 hours on a single workstation (10-core CPU, 64 GB RAM); training takes approximately 2 hours on a single consumer GPU (NVIDIA RTX 4090). The entire pipeline from simulation to deployed model takes less than a day. No location metadata, building-type classification, or HVAC information is required at inference time—only 168 hours of historical load data.</w:t>
       </w:r>
     </w:p>
     <w:bookmarkEnd w:id="30"/>
-    <w:bookmarkStart w:id="31" w:name="practical-implications"/>
+    <w:bookmarkStart w:id="31" w:name="limitations"/>
     <w:p>
       <w:pPr>
         <w:pStyle w:val="Heading3"/>
       </w:pPr>
       <w:r>
-        <w:rPr>
-          <w:rStyle w:val="SectionNumber"/>
-        </w:rPr>
-        <w:t xml:space="preserve">1.6.3</w:t>
-      </w:r>
-      <w:r>
-        <w:tab/>
-      </w:r>
-      <w:r>
-        <w:t xml:space="preserve">5.3 Practical Implications</w:t>
+        <w:t xml:space="preserve">5.4 Limitations</w:t>
       </w:r>
     </w:p>
     <w:p>
@@ -3791,7 +3598,7 @@
         <w:pStyle w:val="FirstParagraph"/>
       </w:pPr>
       <w:r>
-        <w:t xml:space="preserve">The reframing from scale to design has immediate practical consequences. An organization can generate several hundred parametric EnergyPlus simulations conforming to local building codes and climate, train a standard Transformer with RevIN and augmentation, and deploy zero-shot forecasting—without assembling a national building stock database.</w:t>
+        <w:t xml:space="preserve">Our parametric simulations differ from the stock-model baseline in schedule design, climate, building codes, and envelope parameters. The equal-scale controlled experiment (Section 4.1) controls for augmentation, model architecture, and training budget, but cannot fully disentangle all data-source-related confounds. The U.S.-TMY ablation substantially reduces but does not eliminate the climate-origin confound.</w:t>
       </w:r>
     </w:p>
     <w:p>
@@ -3799,34 +3606,7 @@
         <w:pStyle w:val="BodyText"/>
       </w:pPr>
       <w:r>
-        <w:t xml:space="preserve">The computational cost is modest: 700 simulations complete in approximately 4 hours on a single workstation; training takes approximately 2 hours on a single GPU. The entire pipeline from simulation to deployed model takes less than a day. No location metadata, building-type classification, or HVAC information is required at inference time—only 168 hours of historical load data.</w:t>
-      </w:r>
-    </w:p>
-    <w:bookmarkEnd w:id="31"/>
-    <w:bookmarkStart w:id="32" w:name="limitations"/>
-    <w:p>
-      <w:pPr>
-        <w:pStyle w:val="Heading3"/>
-      </w:pPr>
-      <w:r>
-        <w:rPr>
-          <w:rStyle w:val="SectionNumber"/>
-        </w:rPr>
-        <w:t xml:space="preserve">1.6.4</w:t>
-      </w:r>
-      <w:r>
-        <w:tab/>
-      </w:r>
-      <w:r>
-        <w:t xml:space="preserve">5.4 Limitations</w:t>
-      </w:r>
-    </w:p>
-    <w:p>
-      <w:pPr>
-        <w:pStyle w:val="FirstParagraph"/>
-      </w:pPr>
-      <w:r>
-        <w:t xml:space="preserve">Our parametric simulations differ from BuildingsBench in schedule design, climate, building codes, and envelope parameters. The equal-scale controlled experiment (Section 4.1) isolates the data-source effect under matched augmentation, but cannot fully disentangle all confounds. The U.S.-TMY ablation substantially reduces but does not eliminate the climate-origin confound.</w:t>
+        <w:t xml:space="preserve">The augmentation applied to our method (window jitter, Gaussian noise, amplitude scaling) was not part of the original stock-model training pipeline. The aug-matched control addresses this asymmetry at equal scale, but the comparison with the original baseline (which uses no augmentation) includes this confound. Even without augmentation, our method outperforms the aug-matched stock-model control (Table 3), but falls above the full-scale baseline.</w:t>
       </w:r>
     </w:p>
     <w:p>
@@ -3834,7 +3614,7 @@
         <w:pStyle w:val="BodyText"/>
       </w:pPr>
       <w:r>
-        <w:t xml:space="preserve">The augmentation applied to Korean-700 (window jitter, Gaussian noise, amplitude scaling) was not part of the original BuildingsBench training pipeline. The aug-matched BB-700 control addresses this asymmetry at equal scale, but the comparison between Korean-700 and the original BB-900K (which uses no augmentation) includes this confound. Augmentation contributes 0.56 pp to Korean-700 (13.67% → 13.11%); even without augmentation, Korean-700 (13.67%) outperforms BB-700 aug (14.26%), but falls above the BB-900K baseline (13.27%).</w:t>
+        <w:t xml:space="preserve">The objective of this study is not to claim a large performance breakthrough, but to demonstrate that a systematically designed simulation dataset can provide competitive zero-shot transfer with substantially lower data requirements. The margin between the designed dataset and the large-scale reference is comparable to inter-seed variation (Table 3). The paired per-building comparison confirms statistical significance (Section 4.1), but the margin is small. The contribution is methodological: showing that systematic simulation design can substantially reduce reliance on brute-force dataset scaling in this benchmark setting.</w:t>
       </w:r>
     </w:p>
     <w:p>
@@ -3842,15 +3622,7 @@
         <w:pStyle w:val="BodyText"/>
       </w:pPr>
       <w:r>
-        <w:t xml:space="preserve">The aggregate improvement over the BB-900K baseline (0.16 pp) is modest and comparable to inter-seed variation (0.17%). The paired per-building comparison confirms statistical significance (p &lt; 0.001, 71% win rate), but the margin is small. The claim is not that Korean-700 dramatically exceeds the baseline, but that it matches the baseline with 1,286× fewer buildings—supporting the hypothesis that pattern coverage, not scale, is the operative factor.</w:t>
-      </w:r>
-    </w:p>
-    <w:p>
-      <w:pPr>
-        <w:pStyle w:val="BodyText"/>
-      </w:pPr>
-      <w:r>
-        <w:t xml:space="preserve">All experiments use Transformer-M (15.8M parameters); generalization to PatchTST, MOIRAI, or other architectures has not been tested. On residential buildings (953 buildings), our model yields 77.71% NRMSE, comparable to the Persistence Ensemble (77.88%), confirming that zero-shot residential forecasting remains an open problem. Real-world validation beyond the BuildingsBench evaluation set has not been conducted; broader testing across diverse building types in multiple countries is needed.</w:t>
+        <w:t xml:space="preserve">All experiments use a single model architecture (Transformer-M); generalization to PatchTST, MOIRAI, or other architectures has not been tested. On residential buildings, our model yields accuracy comparable to the Persistence Ensemble, confirming that zero-shot residential forecasting remains an open problem. Real-world validation beyond the evaluation set used in this study has not been conducted; broader testing across diverse building types in multiple countries is needed.</w:t>
       </w:r>
     </w:p>
     <w:p>
@@ -3860,23 +3632,14 @@
         </w:pict>
       </w:r>
     </w:p>
+    <w:bookmarkEnd w:id="31"/>
     <w:bookmarkEnd w:id="32"/>
-    <w:bookmarkEnd w:id="33"/>
-    <w:bookmarkStart w:id="34" w:name="conclusion"/>
+    <w:bookmarkStart w:id="33" w:name="conclusion"/>
     <w:p>
       <w:pPr>
         <w:pStyle w:val="Heading2"/>
       </w:pPr>
       <w:r>
-        <w:rPr>
-          <w:rStyle w:val="SectionNumber"/>
-        </w:rPr>
-        <w:t xml:space="preserve">1.7</w:t>
-      </w:r>
-      <w:r>
-        <w:tab/>
-      </w:r>
-      <w:r>
         <w:t xml:space="preserve">6. Conclusion</w:t>
       </w:r>
     </w:p>
@@ -3885,7 +3648,7 @@
         <w:pStyle w:val="FirstParagraph"/>
       </w:pPr>
       <w:r>
-        <w:t xml:space="preserve">We proposed and tested the Operational Diversity Hypothesis: zero-shot building load forecasting accuracy is governed by the coverage of temporal load patterns in the training set, not by corpus scale. Four lines of evidence support this hypothesis: (1) equal-scale controlled experiments show a persistent data-design advantage exceeding 1 pp; (2) n-scaling saturates at 70 buildings; (3) RevIN’s regime-dependent effect is mechanistically consistent with pattern-coverage-governed learning; and (4) cross-climate transfer confirms that schedule diversity, not climate origin, drives generalization.</w:t>
+        <w:t xml:space="preserve">We presented a parametric simulation design methodology for zero-shot building load forecasting, grounded in the Operational Diversity Hypothesis. The methodology defines a multi-dimensional operational schedule parameter space, uses LHS to promote broad coverage of temporal operating patterns across commercial building archetypes, and combines the resulting dataset with RevIN and data augmentation. Four lines of evidence support the approach: (1) equal-scale controlled experiments provide evidence of a consistent data-design advantage across multiple comparisons; (2) n-scaling shows diminishing returns beyond a modest number of buildings, consistent with pattern-coverage-governed learning; (3) RevIN’s regime-dependent effect is mechanistically consistent with the decoupled magnitude structure of LHS-designed data; and (4) cross-climate transfer shows that the benefit persists under different weather files, reducing the likelihood that results are attributable solely to climate origin.</w:t>
       </w:r>
     </w:p>
     <w:p>
@@ -3893,7 +3656,7 @@
         <w:pStyle w:val="BodyText"/>
       </w:pPr>
       <w:r>
-        <w:t xml:space="preserve">The practical implication is a reframing of the data requirement: from assembling a national building stock database to designing a few hundred simulations with maximal operational diversity. This reduces the barrier to deploying zero-shot building energy forecasting in data-sparse regions from a data-engineering problem requiring access to national building stock models to a simulation design problem solvable on a single workstation.</w:t>
+        <w:t xml:space="preserve">The methodology reframes the data requirement for zero-shot building energy forecasting: from assembling a national building stock database to designing a few hundred simulations with broad operational diversity. This reduces the barrier to deployment in data-sparse regions from a data-engineering problem requiring access to national stock models to a simulation design problem solvable on a single workstation in less than a day.</w:t>
       </w:r>
     </w:p>
     <w:p>
@@ -3901,7 +3664,7 @@
         <w:pStyle w:val="BodyText"/>
       </w:pPr>
       <w:r>
-        <w:t xml:space="preserve">The principal open questions are the limitation to commercial buildings, the augmentation asymmetry between pipelines, and the untested generalization to other model architectures. Extending the operational diversity framework to residential buildings—where zero-shot performance remains at Persistence-level—is a natural next step.</w:t>
+        <w:t xml:space="preserve">The principal open questions are the limitation to commercial buildings, the augmentation asymmetry between training pipelines, and the untested generalization to other model architectures. Extending the operational diversity framework to residential buildings—where zero-shot performance remains at Persistence-level—is a natural next step.</w:t>
       </w:r>
     </w:p>
     <w:p>
@@ -3911,31 +3674,35 @@
         </w:pict>
       </w:r>
     </w:p>
-    <w:bookmarkEnd w:id="34"/>
-    <w:bookmarkStart w:id="35" w:name="references"/>
+    <w:bookmarkEnd w:id="33"/>
+    <w:bookmarkStart w:id="34" w:name="references"/>
     <w:p>
       <w:pPr>
         <w:pStyle w:val="Heading2"/>
       </w:pPr>
       <w:r>
+        <w:t xml:space="preserve">References</w:t>
+      </w:r>
+    </w:p>
+    <w:p>
+      <w:pPr>
+        <w:pStyle w:val="FirstParagraph"/>
+      </w:pPr>
+      <w:r>
+        <w:t xml:space="preserve">Amasyali K, El-Gohary NM (2018). A review of data-driven building energy consumption prediction studies.</w:t>
+      </w:r>
+      <w:r>
+        <w:t xml:space="preserve"> </w:t>
+      </w:r>
+      <w:r>
         <w:rPr>
-          <w:rStyle w:val="SectionNumber"/>
+          <w:i/>
+          <w:iCs/>
         </w:rPr>
-        <w:t xml:space="preserve">1.8</w:t>
-      </w:r>
-      <w:r>
-        <w:tab/>
-      </w:r>
-      <w:r>
-        <w:t xml:space="preserve">References</w:t>
-      </w:r>
-    </w:p>
-    <w:p>
-      <w:pPr>
-        <w:pStyle w:val="FirstParagraph"/>
-      </w:pPr>
-      <w:r>
-        <w:t xml:space="preserve">[1] Fan C, et al. A short-term building cooling load prediction method using deep learning algorithms. Appl Energy 2017;195:222–33.</w:t>
+        <w:t xml:space="preserve">Renewable and Sustainable Energy Reviews</w:t>
+      </w:r>
+      <w:r>
+        <w:t xml:space="preserve">, 81: 1192–1205.</w:t>
       </w:r>
     </w:p>
     <w:p>
@@ -3943,7 +3710,20 @@
         <w:pStyle w:val="BodyText"/>
       </w:pPr>
       <w:r>
-        <w:t xml:space="preserve">[2] Hong T, et al. Ten questions on urban building energy modeling. Build Environ 2019;168:106508.</w:t>
+        <w:t xml:space="preserve">Ansari AF, et al. (2024). Chronos: Learning the Language of Time Series.</w:t>
+      </w:r>
+      <w:r>
+        <w:t xml:space="preserve"> </w:t>
+      </w:r>
+      <w:r>
+        <w:rPr>
+          <w:i/>
+          <w:iCs/>
+        </w:rPr>
+        <w:t xml:space="preserve">Transactions on Machine Learning Research</w:t>
+      </w:r>
+      <w:r>
+        <w:t xml:space="preserve">.</w:t>
       </w:r>
     </w:p>
     <w:p>
@@ -3951,7 +3731,20 @@
         <w:pStyle w:val="BodyText"/>
       </w:pPr>
       <w:r>
-        <w:t xml:space="preserve">[3] Emami P, Sahu A, Graf P. BuildingsBench: A Large-Scale Dataset of 900K Buildings and Benchmark for Short-Term Load Forecasting. Adv Neural Inf Process Syst 2023;36.</w:t>
+        <w:t xml:space="preserve">Box GEP, Cox DR (1964). An Analysis of Transformations.</w:t>
+      </w:r>
+      <w:r>
+        <w:t xml:space="preserve"> </w:t>
+      </w:r>
+      <w:r>
+        <w:rPr>
+          <w:i/>
+          <w:iCs/>
+        </w:rPr>
+        <w:t xml:space="preserve">Journal of the Royal Statistical Society, Series B</w:t>
+      </w:r>
+      <w:r>
+        <w:t xml:space="preserve">, 26(2): 211–252.</w:t>
       </w:r>
     </w:p>
     <w:p>
@@ -3959,7 +3752,7 @@
         <w:pStyle w:val="BodyText"/>
       </w:pPr>
       <w:r>
-        <w:t xml:space="preserve">[4] Wilson E, et al. End-Use Load Profiles for the U.S. Building Stock. Golden (CO): National Renewable Energy Laboratory; 2022. Report No.: NREL/TP-5500-80889.</w:t>
+        <w:t xml:space="preserve">Chen T, Guestrin C (2016). XGBoost: A Scalable Tree Boosting System. In: Proceedings of the 22nd ACM SIGKDD International Conference on Knowledge Discovery and Data Mining, pp. 785–794.</w:t>
       </w:r>
     </w:p>
     <w:p>
@@ -3967,7 +3760,20 @@
         <w:pStyle w:val="BodyText"/>
       </w:pPr>
       <w:r>
-        <w:t xml:space="preserve">[5] Shi J, et al. Scaling Law for Time Series Forecasting. Adv Neural Inf Process Syst 2024;37.</w:t>
+        <w:t xml:space="preserve">Crawley DB, et al. (2001). EnergyPlus: creating a new-generation building energy simulation program.</w:t>
+      </w:r>
+      <w:r>
+        <w:t xml:space="preserve"> </w:t>
+      </w:r>
+      <w:r>
+        <w:rPr>
+          <w:i/>
+          <w:iCs/>
+        </w:rPr>
+        <w:t xml:space="preserve">Energy and Buildings</w:t>
+      </w:r>
+      <w:r>
+        <w:t xml:space="preserve">, 33(4): 319–331.</w:t>
       </w:r>
     </w:p>
     <w:p>
@@ -3975,7 +3781,20 @@
         <w:pStyle w:val="BodyText"/>
       </w:pPr>
       <w:r>
-        <w:t xml:space="preserve">[6] Liu X, et al. MOIRAI-MoE: Empowering Time Series Foundation Models with Sparse Mixture of Experts. Proc Mach Learn Res 2025;267:38940–62.</w:t>
+        <w:t xml:space="preserve">Das A, et al. (2024). A decoder-only foundation model for time-series forecasting.</w:t>
+      </w:r>
+      <w:r>
+        <w:t xml:space="preserve"> </w:t>
+      </w:r>
+      <w:r>
+        <w:rPr>
+          <w:i/>
+          <w:iCs/>
+        </w:rPr>
+        <w:t xml:space="preserve">Proceedings of Machine Learning Research</w:t>
+      </w:r>
+      <w:r>
+        <w:t xml:space="preserve">, 235: 10148–10167.</w:t>
       </w:r>
     </w:p>
     <w:p>
@@ -3983,7 +3802,7 @@
         <w:pStyle w:val="BodyText"/>
       </w:pPr>
       <w:r>
-        <w:t xml:space="preserve">[7] Zha D, et al. Data-centric AI: Perspectives and Challenges. Proc SIAM Int Conf Data Min; 2023. p. 945–8.</w:t>
+        <w:t xml:space="preserve">Deru M, et al. (2011). U.S. Department of Energy Commercial Reference Building Models of the National Building Stock. Golden, CO: National Renewable Energy Laboratory. Report No.: NREL/TP-5500-46861.</w:t>
       </w:r>
     </w:p>
     <w:p>
@@ -3991,7 +3810,20 @@
         <w:pStyle w:val="BodyText"/>
       </w:pPr>
       <w:r>
-        <w:t xml:space="preserve">[8] Kim T, et al. Reversible Instance Normalization for Accurate Time-Series Forecasting against Distribution Shift. Int Conf Learn Represent; 2022.</w:t>
+        <w:t xml:space="preserve">Emami P, Sahu A, Graf P (2023). BuildingsBench: A Large-Scale Dataset of 900K Buildings and Benchmark for Short-Term Load Forecasting.</w:t>
+      </w:r>
+      <w:r>
+        <w:t xml:space="preserve"> </w:t>
+      </w:r>
+      <w:r>
+        <w:rPr>
+          <w:i/>
+          <w:iCs/>
+        </w:rPr>
+        <w:t xml:space="preserve">Advances in Neural Information Processing Systems</w:t>
+      </w:r>
+      <w:r>
+        <w:t xml:space="preserve">, 36.</w:t>
       </w:r>
     </w:p>
     <w:p>
@@ -3999,7 +3831,20 @@
         <w:pStyle w:val="BodyText"/>
       </w:pPr>
       <w:r>
-        <w:t xml:space="preserve">[9] Amasyali K, El-Gohary NM. A review of data-driven building energy consumption prediction studies. Renew Sustain Energy Rev 2018;81:1192–205.</w:t>
+        <w:t xml:space="preserve">Fan C, et al. (2017). A short-term building cooling load prediction method using deep learning algorithms.</w:t>
+      </w:r>
+      <w:r>
+        <w:t xml:space="preserve"> </w:t>
+      </w:r>
+      <w:r>
+        <w:rPr>
+          <w:i/>
+          <w:iCs/>
+        </w:rPr>
+        <w:t xml:space="preserve">Applied Energy</w:t>
+      </w:r>
+      <w:r>
+        <w:t xml:space="preserve">, 195: 222–233.</w:t>
       </w:r>
     </w:p>
     <w:p>
@@ -4007,7 +3852,20 @@
         <w:pStyle w:val="BodyText"/>
       </w:pPr>
       <w:r>
-        <w:t xml:space="preserve">[10] Chen T, Guestrin C. XGBoost: A Scalable Tree Boosting System. Proc 22nd ACM SIGKDD Int Conf Knowl Discov Data Min; 2016. p. 785–94.</w:t>
+        <w:t xml:space="preserve">Hochreiter S, Schmidhuber J (1997). Long Short-Term Memory.</w:t>
+      </w:r>
+      <w:r>
+        <w:t xml:space="preserve"> </w:t>
+      </w:r>
+      <w:r>
+        <w:rPr>
+          <w:i/>
+          <w:iCs/>
+        </w:rPr>
+        <w:t xml:space="preserve">Neural Computation</w:t>
+      </w:r>
+      <w:r>
+        <w:t xml:space="preserve">, 9(8): 1735–1780.</w:t>
       </w:r>
     </w:p>
     <w:p>
@@ -4015,7 +3873,20 @@
         <w:pStyle w:val="BodyText"/>
       </w:pPr>
       <w:r>
-        <w:t xml:space="preserve">[11] Hochreiter S, Schmidhuber J. Long Short-Term Memory. Neural Comput 1997;9(8):1735–80.</w:t>
+        <w:t xml:space="preserve">Hong T, et al. (2019). Ten questions on urban building energy modeling.</w:t>
+      </w:r>
+      <w:r>
+        <w:t xml:space="preserve"> </w:t>
+      </w:r>
+      <w:r>
+        <w:rPr>
+          <w:i/>
+          <w:iCs/>
+        </w:rPr>
+        <w:t xml:space="preserve">Building and Environment</w:t>
+      </w:r>
+      <w:r>
+        <w:t xml:space="preserve">, 168: 106508.</w:t>
       </w:r>
     </w:p>
     <w:p>
@@ -4023,7 +3894,7 @@
         <w:pStyle w:val="BodyText"/>
       </w:pPr>
       <w:r>
-        <w:t xml:space="preserve">[12] Vaswani A, et al. Attention Is All You Need. Adv Neural Inf Process Syst 2017;30.</w:t>
+        <w:t xml:space="preserve">Kim T, et al. (2022). Reversible Instance Normalization for Accurate Time-Series Forecasting against Distribution Shift. In: International Conference on Learning Representations.</w:t>
       </w:r>
     </w:p>
     <w:p>
@@ -4031,7 +3902,20 @@
         <w:pStyle w:val="BodyText"/>
       </w:pPr>
       <w:r>
-        <w:t xml:space="preserve">[13] Nie Y, et al. A Time Series is Worth 64 Words: Long-term Forecasting with Transformers. Int Conf Learn Represent; 2023.</w:t>
+        <w:t xml:space="preserve">Liu X, et al. (2025). MOIRAI-MoE: Empowering Time Series Foundation Models with Sparse Mixture of Experts.</w:t>
+      </w:r>
+      <w:r>
+        <w:t xml:space="preserve"> </w:t>
+      </w:r>
+      <w:r>
+        <w:rPr>
+          <w:i/>
+          <w:iCs/>
+        </w:rPr>
+        <w:t xml:space="preserve">Proceedings of Machine Learning Research</w:t>
+      </w:r>
+      <w:r>
+        <w:t xml:space="preserve">, 267: 38940–38962.</w:t>
       </w:r>
     </w:p>
     <w:p>
@@ -4039,7 +3923,7 @@
         <w:pStyle w:val="BodyText"/>
       </w:pPr>
       <w:r>
-        <w:t xml:space="preserve">[14] Ribeiro M, et al. Transfer learning with seasonal and trend adjustment for cross-building energy forecasting. Energy Build 2018;165:352–63.</w:t>
+        <w:t xml:space="preserve">Loshchilov I, Hutter F (2019). Decoupled Weight Decay Regularization. In: International Conference on Learning Representations.</w:t>
       </w:r>
     </w:p>
     <w:p>
@@ -4047,7 +3931,20 @@
         <w:pStyle w:val="BodyText"/>
       </w:pPr>
       <w:r>
-        <w:t xml:space="preserve">[15] Spencer R, et al. Transfer Learning on Transformers for Building Energy Consumption Forecasting — A Comparative Study. Energy Build 2025;336:115632.</w:t>
+        <w:t xml:space="preserve">McKay MD, Beckman RJ, Conover WJ (1979). A Comparison of Three Methods for Selecting Values of Input Variables in the Analysis of Output from a Computer Code.</w:t>
+      </w:r>
+      <w:r>
+        <w:t xml:space="preserve"> </w:t>
+      </w:r>
+      <w:r>
+        <w:rPr>
+          <w:i/>
+          <w:iCs/>
+        </w:rPr>
+        <w:t xml:space="preserve">Technometrics</w:t>
+      </w:r>
+      <w:r>
+        <w:t xml:space="preserve">, 21(2): 239–245.</w:t>
       </w:r>
     </w:p>
     <w:p>
@@ -4055,7 +3952,20 @@
         <w:pStyle w:val="BodyText"/>
       </w:pPr>
       <w:r>
-        <w:t xml:space="preserve">[16] Das A, et al. A decoder-only foundation model for time-series forecasting. Proc Mach Learn Res 2024;235:10148–67.</w:t>
+        <w:t xml:space="preserve">Miller C, et al. (2020). The Building Data Genome Project 2, energy meter data from the ASHRAE Great Energy Predictor III competition.</w:t>
+      </w:r>
+      <w:r>
+        <w:t xml:space="preserve"> </w:t>
+      </w:r>
+      <w:r>
+        <w:rPr>
+          <w:i/>
+          <w:iCs/>
+        </w:rPr>
+        <w:t xml:space="preserve">Scientific Data</w:t>
+      </w:r>
+      <w:r>
+        <w:t xml:space="preserve">, 7: 368.</w:t>
       </w:r>
     </w:p>
     <w:p>
@@ -4063,7 +3973,7 @@
         <w:pStyle w:val="BodyText"/>
       </w:pPr>
       <w:r>
-        <w:t xml:space="preserve">[17] Ansari AF, et al. Chronos: Learning the Language of Time Series. Trans Mach Learn Res 2024.</w:t>
+        <w:t xml:space="preserve">Nie Y, et al. (2023). A Time Series is Worth 64 Words: Long-term Forecasting with Transformers. In: International Conference on Learning Representations.</w:t>
       </w:r>
     </w:p>
     <w:p>
@@ -4071,7 +3981,7 @@
         <w:pStyle w:val="BodyText"/>
       </w:pPr>
       <w:r>
-        <w:t xml:space="preserve">[18] Rasul K, et al. Lag-Llama: Towards Foundation Models for Probabilistic Time Series Forecasting. NeurIPS Workshop Robustness Found Models; 2023.</w:t>
+        <w:t xml:space="preserve">Rasul K, et al. (2023). Lag-Llama: Towards Foundation Models for Probabilistic Time Series Forecasting. In: NeurIPS Workshop on Robustness of Foundation Models.</w:t>
       </w:r>
     </w:p>
     <w:p>
@@ -4079,7 +3989,20 @@
         <w:pStyle w:val="BodyText"/>
       </w:pPr>
       <w:r>
-        <w:t xml:space="preserve">[19] Woo G, et al. Unified Training of Universal Time Series Forecasting Transformers. Proc Mach Learn Res 2024;235:53140–64.</w:t>
+        <w:t xml:space="preserve">Ribeiro M, et al. (2018). Transfer learning with seasonal and trend adjustment for cross-building energy forecasting.</w:t>
+      </w:r>
+      <w:r>
+        <w:t xml:space="preserve"> </w:t>
+      </w:r>
+      <w:r>
+        <w:rPr>
+          <w:i/>
+          <w:iCs/>
+        </w:rPr>
+        <w:t xml:space="preserve">Energy and Buildings</w:t>
+      </w:r>
+      <w:r>
+        <w:t xml:space="preserve">, 165: 352–363.</w:t>
       </w:r>
     </w:p>
     <w:p>
@@ -4087,7 +4010,20 @@
         <w:pStyle w:val="BodyText"/>
       </w:pPr>
       <w:r>
-        <w:t xml:space="preserve">[20] Yao Q, et al. Towards Neural Scaling Laws for Time Series Foundation Models. Int Conf Learn Represent; 2025.</w:t>
+        <w:t xml:space="preserve">Shi J, et al. (2024). Scaling Law for Time Series Forecasting.</w:t>
+      </w:r>
+      <w:r>
+        <w:t xml:space="preserve"> </w:t>
+      </w:r>
+      <w:r>
+        <w:rPr>
+          <w:i/>
+          <w:iCs/>
+        </w:rPr>
+        <w:t xml:space="preserve">Advances in Neural Information Processing Systems</w:t>
+      </w:r>
+      <w:r>
+        <w:t xml:space="preserve">, 37.</w:t>
       </w:r>
     </w:p>
     <w:p>
@@ -4095,7 +4031,20 @@
         <w:pStyle w:val="BodyText"/>
       </w:pPr>
       <w:r>
-        <w:t xml:space="preserve">[21] Crawley DB, et al. EnergyPlus: creating a new-generation building energy simulation program. Energy Build 2001;33(4):319–31.</w:t>
+        <w:t xml:space="preserve">Spencer R, et al. (2025). Transfer Learning on Transformers for Building Energy Consumption Forecasting — A Comparative Study.</w:t>
+      </w:r>
+      <w:r>
+        <w:t xml:space="preserve"> </w:t>
+      </w:r>
+      <w:r>
+        <w:rPr>
+          <w:i/>
+          <w:iCs/>
+        </w:rPr>
+        <w:t xml:space="preserve">Energy and Buildings</w:t>
+      </w:r>
+      <w:r>
+        <w:t xml:space="preserve">, 336: 115632.</w:t>
       </w:r>
     </w:p>
     <w:p>
@@ -4103,7 +4052,7 @@
         <w:pStyle w:val="BodyText"/>
       </w:pPr>
       <w:r>
-        <w:t xml:space="preserve">[22] Deru M, et al. U.S. Department of Energy Commercial Reference Building Models of the National Building Stock. Golden (CO): National Renewable Energy Laboratory; 2011. Report No.: NREL/TP-5500-46861.</w:t>
+        <w:t xml:space="preserve">Trindade A (2015). ElectricityLoadDiagrams20112014 [dataset]. UCI Machine Learning Repository.</w:t>
       </w:r>
     </w:p>
     <w:p>
@@ -4111,7 +4060,20 @@
         <w:pStyle w:val="BodyText"/>
       </w:pPr>
       <w:r>
-        <w:t xml:space="preserve">[23] McKay MD, Beckman RJ, Conover WJ. A Comparison of Three Methods for Selecting Values of Input Variables in the Analysis of Output from a Computer Code. Technometrics 1979;21(2):239–45.</w:t>
+        <w:t xml:space="preserve">Vaswani A, et al. (2017). Attention Is All You Need.</w:t>
+      </w:r>
+      <w:r>
+        <w:t xml:space="preserve"> </w:t>
+      </w:r>
+      <w:r>
+        <w:rPr>
+          <w:i/>
+          <w:iCs/>
+        </w:rPr>
+        <w:t xml:space="preserve">Advances in Neural Information Processing Systems</w:t>
+      </w:r>
+      <w:r>
+        <w:t xml:space="preserve">, 30.</w:t>
       </w:r>
     </w:p>
     <w:p>
@@ -4119,7 +4081,7 @@
         <w:pStyle w:val="BodyText"/>
       </w:pPr>
       <w:r>
-        <w:t xml:space="preserve">[24] Box GEP, Cox DR. An Analysis of Transformations. J R Stat Soc B 1964;26(2):211–52.</w:t>
+        <w:t xml:space="preserve">Wilson E, et al. (2022). End-Use Load Profiles for the U.S. Building Stock. Golden, CO: National Renewable Energy Laboratory. Report No.: NREL/TP-5500-80889.</w:t>
       </w:r>
     </w:p>
     <w:p>
@@ -4127,7 +4089,20 @@
         <w:pStyle w:val="BodyText"/>
       </w:pPr>
       <w:r>
-        <w:t xml:space="preserve">[25] Loshchilov I, Hutter F. Decoupled Weight Decay Regularization. Int Conf Learn Represent; 2019.</w:t>
+        <w:t xml:space="preserve">Woo G, et al. (2024). Unified Training of Universal Time Series Forecasting Transformers.</w:t>
+      </w:r>
+      <w:r>
+        <w:t xml:space="preserve"> </w:t>
+      </w:r>
+      <w:r>
+        <w:rPr>
+          <w:i/>
+          <w:iCs/>
+        </w:rPr>
+        <w:t xml:space="preserve">Proceedings of Machine Learning Research</w:t>
+      </w:r>
+      <w:r>
+        <w:t xml:space="preserve">, 235: 53140–53164.</w:t>
       </w:r>
     </w:p>
     <w:p>
@@ -4135,7 +4110,7 @@
         <w:pStyle w:val="BodyText"/>
       </w:pPr>
       <w:r>
-        <w:t xml:space="preserve">[26] Miller C, et al. The Building Data Genome Project 2, energy meter data from the ASHRAE Great Energy Predictor III competition. Sci Data 2020;7:368.</w:t>
+        <w:t xml:space="preserve">Yao Q, et al. (2025). Towards Neural Scaling Laws for Time Series Foundation Models. In: International Conference on Learning Representations.</w:t>
       </w:r>
     </w:p>
     <w:p>
@@ -4143,7 +4118,7 @@
         <w:pStyle w:val="BodyText"/>
       </w:pPr>
       <w:r>
-        <w:t xml:space="preserve">[27] Trindade A. ElectricityLoadDiagrams20112014 [dataset]. UCI Machine Learning Repository; 2015.</w:t>
+        <w:t xml:space="preserve">Zha D, et al. (2023). Data-centric AI: Perspectives and Challenges. In: Proceedings of the SIAM International Conference on Data Mining, pp. 945–948.</w:t>
       </w:r>
     </w:p>
     <w:p>
@@ -4172,39 +4147,21 @@
         </w:pict>
       </w:r>
     </w:p>
-    <w:bookmarkEnd w:id="35"/>
-    <w:bookmarkStart w:id="41" w:name="appendix-a-multi-seed-results"/>
+    <w:bookmarkEnd w:id="34"/>
+    <w:bookmarkStart w:id="40" w:name="appendix-a-multi-seed-results"/>
     <w:p>
       <w:pPr>
         <w:pStyle w:val="Heading2"/>
       </w:pPr>
       <w:r>
-        <w:rPr>
-          <w:rStyle w:val="SectionNumber"/>
-        </w:rPr>
-        <w:t xml:space="preserve">1.9</w:t>
-      </w:r>
-      <w:r>
-        <w:tab/>
-      </w:r>
-      <w:r>
         <w:t xml:space="preserve">Appendix A: Multi-Seed Results</w:t>
       </w:r>
     </w:p>
-    <w:bookmarkStart w:id="36" w:name="a.1-korean-700-revin-on-s-18000-5-seeds"/>
+    <w:bookmarkStart w:id="35" w:name="a.1-korean-700-revin-on-s-18000-5-seeds"/>
     <w:p>
       <w:pPr>
         <w:pStyle w:val="Heading3"/>
       </w:pPr>
-      <w:r>
-        <w:rPr>
-          <w:rStyle w:val="SectionNumber"/>
-        </w:rPr>
-        <w:t xml:space="preserve">1.9.1</w:t>
-      </w:r>
-      <w:r>
-        <w:tab/>
-      </w:r>
       <w:r>
         <w:t xml:space="preserve">A.1 Korean-700 RevIN ON (s = 18,000, 5 seeds)</w:t>
       </w:r>
@@ -4510,21 +4467,12 @@
         <w:t xml:space="preserve">‡ Four-seed mean (seeds 42, 43, 44, 46); seed 45 NCRPS not evaluated with the retrained checkpoint used for NRMSE.</w:t>
       </w:r>
     </w:p>
-    <w:bookmarkEnd w:id="36"/>
-    <w:bookmarkStart w:id="37" w:name="a.2-korean-700-revin-off-s-18000-3-seeds"/>
+    <w:bookmarkEnd w:id="35"/>
+    <w:bookmarkStart w:id="36" w:name="a.2-korean-700-revin-off-s-18000-3-seeds"/>
     <w:p>
       <w:pPr>
         <w:pStyle w:val="Heading3"/>
       </w:pPr>
-      <w:r>
-        <w:rPr>
-          <w:rStyle w:val="SectionNumber"/>
-        </w:rPr>
-        <w:t xml:space="preserve">1.9.2</w:t>
-      </w:r>
-      <w:r>
-        <w:tab/>
-      </w:r>
       <w:r>
         <w:t xml:space="preserve">A.2 Korean-700 RevIN OFF (s = 18,000, 3 seeds)</w:t>
       </w:r>
@@ -4754,21 +4702,12 @@
         <w:t xml:space="preserve">§ Two-seed mean (seeds 42, 44); seed 43 NCRPS not evaluated.</w:t>
       </w:r>
     </w:p>
-    <w:bookmarkEnd w:id="37"/>
-    <w:bookmarkStart w:id="38" w:name="a.3-korean-700-revin-on-s-16000-5-seeds"/>
+    <w:bookmarkEnd w:id="36"/>
+    <w:bookmarkStart w:id="37" w:name="a.3-korean-700-revin-on-s-16000-5-seeds"/>
     <w:p>
       <w:pPr>
         <w:pStyle w:val="Heading3"/>
       </w:pPr>
-      <w:r>
-        <w:rPr>
-          <w:rStyle w:val="SectionNumber"/>
-        </w:rPr>
-        <w:t xml:space="preserve">1.9.3</w:t>
-      </w:r>
-      <w:r>
-        <w:tab/>
-      </w:r>
       <w:r>
         <w:t xml:space="preserve">A.3 Korean-700 RevIN ON (s = 16,000, 5 seeds)</w:t>
       </w:r>
@@ -4985,21 +4924,12 @@
         </w:tc>
       </w:tr>
     </w:tbl>
-    <w:bookmarkEnd w:id="38"/>
-    <w:bookmarkStart w:id="39" w:name="X19de30977b2efbcd7dd418f1d5e794ff568bf73"/>
+    <w:bookmarkEnd w:id="37"/>
+    <w:bookmarkStart w:id="38" w:name="X19de30977b2efbcd7dd418f1d5e794ff568bf73"/>
     <w:p>
       <w:pPr>
         <w:pStyle w:val="Heading3"/>
       </w:pPr>
-      <w:r>
-        <w:rPr>
-          <w:rStyle w:val="SectionNumber"/>
-        </w:rPr>
-        <w:t xml:space="preserve">1.9.4</w:t>
-      </w:r>
-      <w:r>
-        <w:tab/>
-      </w:r>
       <w:r>
         <w:t xml:space="preserve">A.4 Korean-700 RevIN ON, No Augmentation (s = 18,000, 3 seeds)</w:t>
       </w:r>
@@ -5221,23 +5151,14 @@
         </w:tc>
       </w:tr>
     </w:tbl>
-    <w:bookmarkEnd w:id="39"/>
-    <w:bookmarkStart w:id="40" w:name="a.5-bb-900k-revin"/>
+    <w:bookmarkEnd w:id="38"/>
+    <w:bookmarkStart w:id="39" w:name="a.5-stock-model-900k-revin"/>
     <w:p>
       <w:pPr>
         <w:pStyle w:val="Heading3"/>
       </w:pPr>
       <w:r>
-        <w:rPr>
-          <w:rStyle w:val="SectionNumber"/>
-        </w:rPr>
-        <w:t xml:space="preserve">1.9.5</w:t>
-      </w:r>
-      <w:r>
-        <w:tab/>
-      </w:r>
-      <w:r>
-        <w:t xml:space="preserve">A.5 BB 900K + RevIN</w:t>
+        <w:t xml:space="preserve">A.5 Stock-Model 900K + RevIN</w:t>
       </w:r>
     </w:p>
     <w:p>
@@ -5245,7 +5166,7 @@
         <w:pStyle w:val="FirstParagraph"/>
       </w:pPr>
       <w:r>
-        <w:t xml:space="preserve">The BuildingsBench 900K model retrained with RevIN achieves 13.89%, a 0.62 pp degradation relative to the original 13.27%.</w:t>
+        <w:t xml:space="preserve">The 900K stock-model baseline retrained with RevIN achieves 13.89%, a 0.62 pp degradation relative to the original 13.27%.</w:t>
       </w:r>
     </w:p>
     <w:p>
@@ -5255,24 +5176,15 @@
         </w:pict>
       </w:r>
     </w:p>
+    <w:bookmarkEnd w:id="39"/>
     <w:bookmarkEnd w:id="40"/>
-    <w:bookmarkEnd w:id="41"/>
-    <w:bookmarkStart w:id="42" w:name="appendix-b-bb-700-and-bb-7k-scaling"/>
+    <w:bookmarkStart w:id="41" w:name="Xf34baecae562b35d94eeb23afbde3cae9ef345a"/>
     <w:p>
       <w:pPr>
         <w:pStyle w:val="Heading2"/>
       </w:pPr>
       <w:r>
-        <w:rPr>
-          <w:rStyle w:val="SectionNumber"/>
-        </w:rPr>
-        <w:t xml:space="preserve">1.10</w:t>
-      </w:r>
-      <w:r>
-        <w:tab/>
-      </w:r>
-      <w:r>
-        <w:t xml:space="preserve">Appendix B: BB-700 and BB-7K Scaling</w:t>
+        <w:t xml:space="preserve">Appendix B: Stock-Model Scaling (700 and 7,000 Buildings)</w:t>
       </w:r>
     </w:p>
     <w:tbl>
@@ -5373,7 +5285,7 @@
               <w:pStyle w:val="Compact"/>
             </w:pPr>
             <w:r>
-              <w:t xml:space="preserve">BB-700</w:t>
+              <w:t xml:space="preserve">Stock-700</w:t>
             </w:r>
           </w:p>
         </w:tc>
@@ -5446,7 +5358,7 @@
               <w:pStyle w:val="Compact"/>
             </w:pPr>
             <w:r>
-              <w:t xml:space="preserve">BB-700 (aug)</w:t>
+              <w:t xml:space="preserve">Stock-700 (aug)</w:t>
             </w:r>
           </w:p>
         </w:tc>
@@ -5519,7 +5431,7 @@
               <w:pStyle w:val="Compact"/>
             </w:pPr>
             <w:r>
-              <w:t xml:space="preserve">BB-700</w:t>
+              <w:t xml:space="preserve">Stock-700</w:t>
             </w:r>
           </w:p>
         </w:tc>
@@ -5592,7 +5504,7 @@
               <w:pStyle w:val="Compact"/>
             </w:pPr>
             <w:r>
-              <w:t xml:space="preserve">BB-7K</w:t>
+              <w:t xml:space="preserve">Stock-7K</w:t>
             </w:r>
           </w:p>
         </w:tc>
@@ -5665,7 +5577,7 @@
               <w:pStyle w:val="Compact"/>
             </w:pPr>
             <w:r>
-              <w:t xml:space="preserve">BB-7K</w:t>
+              <w:t xml:space="preserve">Stock-7K</w:t>
             </w:r>
           </w:p>
         </w:tc>
@@ -5736,7 +5648,7 @@
         <w:pStyle w:val="BodyText"/>
       </w:pPr>
       <w:r>
-        <w:t xml:space="preserve">A 10× increase in stock-model buildings (700 to 7,000) reduces NRMSE by only 0.78 pp, and even BB-7K (14.50%) does not approach 700 LHS-designed buildings (13.11%).</w:t>
+        <w:t xml:space="preserve">A 10× increase in stock-model buildings (700 to 7,000) reduces NRMSE by only 0.78 pp, and even 7,000 stock-model buildings (14.50%) do not approach 700 LHS-designed buildings (13.11%).</w:t>
       </w:r>
     </w:p>
     <w:p>
@@ -5746,21 +5658,12 @@
         </w:pict>
       </w:r>
     </w:p>
-    <w:bookmarkEnd w:id="42"/>
-    <w:bookmarkStart w:id="43" w:name="X7705841f826405c94727741dedee731c1f88735"/>
+    <w:bookmarkEnd w:id="41"/>
+    <w:bookmarkStart w:id="42" w:name="X7705841f826405c94727741dedee731c1f88735"/>
     <w:p>
       <w:pPr>
         <w:pStyle w:val="Heading2"/>
       </w:pPr>
-      <w:r>
-        <w:rPr>
-          <w:rStyle w:val="SectionNumber"/>
-        </w:rPr>
-        <w:t xml:space="preserve">1.11</w:t>
-      </w:r>
-      <w:r>
-        <w:tab/>
-      </w:r>
       <w:r>
         <w:t xml:space="preserve">Appendix C: Additional Ablation Results (Earlier Pipeline)</w:t>
       </w:r>
@@ -6028,21 +5931,12 @@
         </w:pict>
       </w:r>
     </w:p>
-    <w:bookmarkEnd w:id="43"/>
-    <w:bookmarkStart w:id="44" w:name="figures"/>
+    <w:bookmarkEnd w:id="42"/>
+    <w:bookmarkStart w:id="43" w:name="figures"/>
     <w:p>
       <w:pPr>
         <w:pStyle w:val="Heading2"/>
       </w:pPr>
-      <w:r>
-        <w:rPr>
-          <w:rStyle w:val="SectionNumber"/>
-        </w:rPr>
-        <w:t xml:space="preserve">1.12</w:t>
-      </w:r>
-      <w:r>
-        <w:tab/>
-      </w:r>
       <w:r>
         <w:t xml:space="preserve">Figures</w:t>
       </w:r>
@@ -6080,7 +5974,7 @@
         <w:t xml:space="preserve"> </w:t>
       </w:r>
       <w:r>
-        <w:t xml:space="preserve">Equal-scale comparison: NRMSE (%) of Korean-700, BB-700, and BB-900K on the 955-building evaluation set. The critical comparison is Korean-700 vs. BB-700 (aug-matched) at identical N = 700, isolating data design as the independent variable. Dashed line: BB-900K baseline (13.27%).</w:t>
+        <w:t xml:space="preserve">Equal-scale comparison: NRMSE (%) of Korean-700, BB-700, and BB-900K on the 955-building evaluation set. The critical comparison is Korean-700 vs. BB-700 (aug-matched) at identical N = 700, comparing data-design effects under matched training conditions. Dashed line: BB-900K baseline (13.27%).</w:t>
       </w:r>
     </w:p>
     <w:p>
@@ -6098,7 +5992,7 @@
         <w:t xml:space="preserve"> </w:t>
       </w:r>
       <w:r>
-        <w:t xml:space="preserve">N-scaling curve showing NRMSE as a function of training buildings (seed = 42). Performance saturates at 70 buildings (n = 5), consistent with pattern-coverage-governed learning.</w:t>
+        <w:t xml:space="preserve">N-scaling curve showing NRMSE as a function of training buildings (seed = 42). Diminishing returns are evident beyond 70 buildings (n = 5), consistent with pattern-coverage-governed learning.</w:t>
       </w:r>
     </w:p>
     <w:p>
@@ -6119,8 +6013,8 @@
         <w:t xml:space="preserve">RevIN’s regime-dependent effect across dataset scales. Green arrows: improvement; red: degradation. The asymmetry between small diverse datasets and the full 900K corpus illustrates regime-dependent normalization.</w:t>
       </w:r>
     </w:p>
+    <w:bookmarkEnd w:id="43"/>
     <w:bookmarkEnd w:id="44"/>
-    <w:bookmarkEnd w:id="45"/>
     <w:sectPr>
       <w:footnotePr>
         <w:numRestart w:val="eachSect"/>

</xml_diff>